<commit_message>
Agrega finanzas personales: formulario, dashboard, asistente IA y avisos por correo
- Formulario publico en /formulario/gastos/julian/palacios con vista previa antes de guardar
- Dashboard en /dashboard/gastos/julian/palacios con sidebar, tarjetas con variacion, grafica de lineas, torta ingresos vs. gastos, gastos por concepto, datos del periodo y tabla con buscador
- Asistente IA de finanzas (alcance 'finanzas' en el chat, sin cupo, preguntas de 200 caracteres)
- Alerta por Gmail cuando los gastos del mes superan los ingresos y resumen al cerrar el mes
- Comando enviar_resumen_finanzas y migraciones de finanzas y chat

Co-Authored-By: Claude Opus 5 <noreply@anthropic.com>
</commit_message>
<xml_diff>
--- a/Pregunta objetica Toky icee-1 (1).docx
+++ b/Pregunta objetica Toky icee-1 (1).docx
@@ -1273,11 +1273,6 @@
         </w:rPr>
         <w:t xml:space="preserve"> ¿Los alimentos sumergidos en nitrógeno líquido son consumibles sin recibir ningún daño?</w:t>
       </w:r>
-      <w:r>
-        <w:rPr>
-          <w:rtl w:val="0"/>
-        </w:rPr>
-      </w:r>
     </w:p>
     <w:p>
       <w:pPr>
@@ -1356,16 +1351,7 @@
           <w:szCs w:val="24"/>
           <w:rtl w:val="0"/>
         </w:rPr>
-        <w:t xml:space="preserve"> Dinámica Térmica Extrema y Gradientes de Temperatura</w:t>
-      </w:r>
-      <w:r>
-        <w:rPr>
-          <w:rFonts w:ascii="Arial" w:cs="Arial" w:eastAsia="Arial" w:hAnsi="Arial"/>
-          <w:sz w:val="24"/>
-          <w:szCs w:val="24"/>
-          <w:rtl w:val="0"/>
-        </w:rPr>
-        <w:t xml:space="preserve">: El nitrógeno elemental en estado líquido se mantiene a una temperatura máxima o superior de ebullición de -195.8°|C a presión atmosférica estándar. Al introducir la masa del mochi (que inicialmente se encuentra a temperatura de congelador o ambiente) dentro del fluido criogénico, se desencadena un proceso violento de ebullición por transferencia de calor por convección y conducción. Al retirar el mochi del contenedor, su capa exterior alcanza registros térmicos que varían entre -140°C y -180°C. Esta condición de frío extremo sitúa al alimento muy por debajo de los niveles de tolerancia de la anatomía humana, creando un riesgo potencial de quemaduras criogénicas por congelación rápida y necrosis del tejido epitelial en caso de contacto prematuro.</w:t>
+        <w:t xml:space="preserve"> Dinámica Térmica Extrema y Gradientes de Temperatura: El nitrógeno elemental en estado líquido se mantiene a una temperatura máxima o superior de ebullición de -195.8°|C a presión atmosférica estándar. Al introducir la masa del mochi (que inicialmente se encuentra a temperatura de congelador o ambiente) dentro del fluido criogénico, se desencadena un proceso violento de ebullición por transferencia de calor por convección y conducción. Al retirar el mochi del contenedor, su capa exterior alcanza registros térmicos que varían entre -140°C y -180°C. Esta condición de frío extremo sitúa al alimento muy por debajo de los niveles de tolerancia de la anatomía humana, creando un riesgo potencial de quemaduras criogénicas por congelación rápida y necrosis del tejido epitelial en caso de contacto prematuro.</w:t>
       </w:r>
     </w:p>
     <w:p>
@@ -2880,6 +2866,4599 @@
           <w:rtl w:val="0"/>
         </w:rPr>
         <w:t xml:space="preserve">La sexta pregunta buscaba identificar el nivel de familiaridad de los encuestados con este tipo de preparación antes de la encuesta. Los resultados muestran que un 30%, traducido en 9 estudiantes, respondió “Solo los había visto en internet”; un 20% 6 estudiantes afirmó “Sí, ya las conozco”; un 33.3% 10 estudiantes respondió “No, no tenía conocimiento previo”; y un 16.7% 5 estudiantes respondió “Tal vez”. Esta pregunta nos brinda una perspectiva clave sobre el valor agregado de nuestro producto y el desafío de marketing que tenemos por delante. Observamos que más del 60% de nuestros potenciales clientes (sumando los que solo lo han visto en internet y los que no lo conocen) carece de una experiencia real con el mochi. Esto nos indica que nuestra estrategia no debe limitarse a vender un dulce, sino a vender una experiencia educativa y visual. Debemos aprovechar este desconocimiento para generar expectativa, mostrando el proceso, el espectáculo del vapor y la seguridad del mismo, convirtiendo la curiosidad de esos 19 estudiantes en nuestra principal herramienta de atracción y fidelización.</w:t>
+      </w:r>
+    </w:p>
+    <w:p>
+      <w:pPr>
+        <w:pageBreakBefore w:val="1"/>
+        <w:spacing w:after="240" w:before="240" w:lineRule="auto"/>
+        <w:jc w:val="center"/>
+        <w:rPr>
+          <w:rFonts w:ascii="Arial" w:cs="Arial" w:eastAsia="Arial" w:hAnsi="Arial"/>
+          <w:b w:val="1"/>
+          <w:bCs w:val="1"/>
+          <w:sz w:val="24"/>
+          <w:szCs w:val="24"/>
+        </w:rPr>
+      </w:pPr>
+      <w:r>
+        <w:rPr>
+          <w:rFonts w:ascii="Arial" w:cs="Arial" w:eastAsia="Arial" w:hAnsi="Arial"/>
+          <w:b w:val="1"/>
+          <w:bCs w:val="1"/>
+          <w:sz w:val="24"/>
+          <w:szCs w:val="24"/>
+          <w:rtl w:val="0"/>
+        </w:rPr>
+        <w:t xml:space="preserve">TABULACIÓN DE LA ENCUESTA</w:t>
+      </w:r>
+    </w:p>
+    <w:p>
+      <w:pPr>
+        <w:spacing w:after="240" w:before="240" w:lineRule="auto"/>
+        <w:rPr>
+          <w:rFonts w:ascii="Arial" w:cs="Arial" w:eastAsia="Arial" w:hAnsi="Arial"/>
+          <w:sz w:val="24"/>
+          <w:szCs w:val="24"/>
+        </w:rPr>
+      </w:pPr>
+      <w:r>
+        <w:rPr>
+          <w:rFonts w:ascii="Arial" w:cs="Arial" w:eastAsia="Arial" w:hAnsi="Arial"/>
+          <w:sz w:val="24"/>
+          <w:szCs w:val="24"/>
+          <w:rtl w:val="0"/>
+        </w:rPr>
+        <w:t xml:space="preserve">La encuesta se aplicó mediante Google Forms a 30 estudiantes del curso 1004 del Colegio Miguel De Cervantes Saavedra, ubicado en la Localidad Quinta de Usme, en la ciudad de Bogotá. A continuación se presenta la tabulación completa de las diez preguntas aplicadas, con la frecuencia y el porcentaje obtenido por cada opción de respuesta.</w:t>
+      </w:r>
+    </w:p>
+    <w:p>
+      <w:pPr>
+        <w:spacing w:after="240" w:before="240" w:lineRule="auto"/>
+        <w:rPr>
+          <w:rFonts w:ascii="Arial" w:cs="Arial" w:eastAsia="Arial" w:hAnsi="Arial"/>
+          <w:b w:val="1"/>
+          <w:bCs w:val="1"/>
+          <w:sz w:val="22"/>
+          <w:szCs w:val="22"/>
+        </w:rPr>
+      </w:pPr>
+      <w:r>
+        <w:rPr>
+          <w:rFonts w:ascii="Arial" w:cs="Arial" w:eastAsia="Arial" w:hAnsi="Arial"/>
+          <w:b w:val="1"/>
+          <w:bCs w:val="1"/>
+          <w:sz w:val="22"/>
+          <w:szCs w:val="22"/>
+          <w:rtl w:val="0"/>
+        </w:rPr>
+        <w:t xml:space="preserve">Tabla 1. ¿Has probado los Mochis?</w:t>
+      </w:r>
+    </w:p>
+    <w:tbl>
+      <w:tblPr>
+        <w:tblStyle w:val="Tablanormal"/>
+        <w:tblW w:w="9360" w:type="dxa"/>
+        <w:jc w:val="left"/>
+        <w:tblBorders>
+          <w:top w:color="000000" w:space="0" w:sz="4" w:val="single"/>
+          <w:left w:color="000000" w:space="0" w:sz="4" w:val="single"/>
+          <w:bottom w:color="000000" w:space="0" w:sz="4" w:val="single"/>
+          <w:right w:color="000000" w:space="0" w:sz="4" w:val="single"/>
+          <w:insideH w:color="000000" w:space="0" w:sz="4" w:val="single"/>
+          <w:insideV w:color="000000" w:space="0" w:sz="4" w:val="single"/>
+        </w:tblBorders>
+        <w:tblLayout w:type="fixed"/>
+        <w:tblCellMar>
+          <w:top w:w="60" w:type="dxa"/>
+          <w:left w:w="108" w:type="dxa"/>
+          <w:bottom w:w="60" w:type="dxa"/>
+          <w:right w:w="108" w:type="dxa"/>
+        </w:tblCellMar>
+      </w:tblPr>
+      <w:tblGrid>
+        <w:gridCol w:w="4680"/>
+        <w:gridCol w:w="2340"/>
+        <w:gridCol w:w="2340"/>
+      </w:tblGrid>
+      <w:tr>
+        <w:trPr>
+          <w:tblHeader/>
+        </w:trPr>
+        <w:tc>
+          <w:tcPr>
+            <w:tcW w:w="4680" w:type="dxa"/>
+            <w:shd w:fill="D9D9D9" w:val="clear"/>
+            <w:vAlign w:val="center"/>
+          </w:tcPr>
+          <w:p>
+            <w:pPr>
+              <w:spacing w:after="40" w:before="40" w:lineRule="auto"/>
+              <w:jc w:val="left"/>
+              <w:rPr>
+                <w:rFonts w:ascii="Arial" w:cs="Arial" w:eastAsia="Arial" w:hAnsi="Arial"/>
+                <w:b w:val="1"/>
+                <w:bCs w:val="1"/>
+                <w:sz w:val="22"/>
+                <w:szCs w:val="22"/>
+              </w:rPr>
+            </w:pPr>
+            <w:r>
+              <w:rPr>
+                <w:rFonts w:ascii="Arial" w:cs="Arial" w:eastAsia="Arial" w:hAnsi="Arial"/>
+                <w:b w:val="1"/>
+                <w:bCs w:val="1"/>
+                <w:sz w:val="22"/>
+                <w:szCs w:val="22"/>
+                <w:rtl w:val="0"/>
+              </w:rPr>
+              <w:t xml:space="preserve">RESPUESTAS</w:t>
+            </w:r>
+          </w:p>
+        </w:tc>
+        <w:tc>
+          <w:tcPr>
+            <w:tcW w:w="2340" w:type="dxa"/>
+            <w:shd w:fill="D9D9D9" w:val="clear"/>
+            <w:vAlign w:val="center"/>
+          </w:tcPr>
+          <w:p>
+            <w:pPr>
+              <w:spacing w:after="40" w:before="40" w:lineRule="auto"/>
+              <w:jc w:val="center"/>
+              <w:rPr>
+                <w:rFonts w:ascii="Arial" w:cs="Arial" w:eastAsia="Arial" w:hAnsi="Arial"/>
+                <w:b w:val="1"/>
+                <w:bCs w:val="1"/>
+                <w:sz w:val="22"/>
+                <w:szCs w:val="22"/>
+              </w:rPr>
+            </w:pPr>
+            <w:r>
+              <w:rPr>
+                <w:rFonts w:ascii="Arial" w:cs="Arial" w:eastAsia="Arial" w:hAnsi="Arial"/>
+                <w:b w:val="1"/>
+                <w:bCs w:val="1"/>
+                <w:sz w:val="22"/>
+                <w:szCs w:val="22"/>
+                <w:rtl w:val="0"/>
+              </w:rPr>
+              <w:t xml:space="preserve">FRECUENCIAS</w:t>
+            </w:r>
+          </w:p>
+        </w:tc>
+        <w:tc>
+          <w:tcPr>
+            <w:tcW w:w="2340" w:type="dxa"/>
+            <w:shd w:fill="D9D9D9" w:val="clear"/>
+            <w:vAlign w:val="center"/>
+          </w:tcPr>
+          <w:p>
+            <w:pPr>
+              <w:spacing w:after="40" w:before="40" w:lineRule="auto"/>
+              <w:jc w:val="center"/>
+              <w:rPr>
+                <w:rFonts w:ascii="Arial" w:cs="Arial" w:eastAsia="Arial" w:hAnsi="Arial"/>
+                <w:b w:val="1"/>
+                <w:bCs w:val="1"/>
+                <w:sz w:val="22"/>
+                <w:szCs w:val="22"/>
+              </w:rPr>
+            </w:pPr>
+            <w:r>
+              <w:rPr>
+                <w:rFonts w:ascii="Arial" w:cs="Arial" w:eastAsia="Arial" w:hAnsi="Arial"/>
+                <w:b w:val="1"/>
+                <w:bCs w:val="1"/>
+                <w:sz w:val="22"/>
+                <w:szCs w:val="22"/>
+                <w:rtl w:val="0"/>
+              </w:rPr>
+              <w:t xml:space="preserve">%</w:t>
+            </w:r>
+          </w:p>
+        </w:tc>
+      </w:tr>
+      <w:tr>
+        <w:tc>
+          <w:tcPr>
+            <w:tcW w:w="4680" w:type="dxa"/>
+            <w:vAlign w:val="center"/>
+          </w:tcPr>
+          <w:p>
+            <w:pPr>
+              <w:spacing w:after="40" w:before="40" w:lineRule="auto"/>
+              <w:jc w:val="left"/>
+              <w:rPr>
+                <w:rFonts w:ascii="Arial" w:cs="Arial" w:eastAsia="Arial" w:hAnsi="Arial"/>
+                <w:sz w:val="22"/>
+                <w:szCs w:val="22"/>
+              </w:rPr>
+            </w:pPr>
+            <w:r>
+              <w:rPr>
+                <w:rFonts w:ascii="Arial" w:cs="Arial" w:eastAsia="Arial" w:hAnsi="Arial"/>
+                <w:sz w:val="22"/>
+                <w:szCs w:val="22"/>
+                <w:rtl w:val="0"/>
+              </w:rPr>
+              <w:t xml:space="preserve">No</w:t>
+            </w:r>
+          </w:p>
+        </w:tc>
+        <w:tc>
+          <w:tcPr>
+            <w:tcW w:w="2340" w:type="dxa"/>
+            <w:vAlign w:val="center"/>
+          </w:tcPr>
+          <w:p>
+            <w:pPr>
+              <w:spacing w:after="40" w:before="40" w:lineRule="auto"/>
+              <w:jc w:val="center"/>
+              <w:rPr>
+                <w:rFonts w:ascii="Arial" w:cs="Arial" w:eastAsia="Arial" w:hAnsi="Arial"/>
+                <w:sz w:val="22"/>
+                <w:szCs w:val="22"/>
+              </w:rPr>
+            </w:pPr>
+            <w:r>
+              <w:rPr>
+                <w:rFonts w:ascii="Arial" w:cs="Arial" w:eastAsia="Arial" w:hAnsi="Arial"/>
+                <w:sz w:val="22"/>
+                <w:szCs w:val="22"/>
+                <w:rtl w:val="0"/>
+              </w:rPr>
+              <w:t xml:space="preserve">20</w:t>
+            </w:r>
+          </w:p>
+        </w:tc>
+        <w:tc>
+          <w:tcPr>
+            <w:tcW w:w="2340" w:type="dxa"/>
+            <w:vAlign w:val="center"/>
+          </w:tcPr>
+          <w:p>
+            <w:pPr>
+              <w:spacing w:after="40" w:before="40" w:lineRule="auto"/>
+              <w:jc w:val="center"/>
+              <w:rPr>
+                <w:rFonts w:ascii="Arial" w:cs="Arial" w:eastAsia="Arial" w:hAnsi="Arial"/>
+                <w:sz w:val="22"/>
+                <w:szCs w:val="22"/>
+              </w:rPr>
+            </w:pPr>
+            <w:r>
+              <w:rPr>
+                <w:rFonts w:ascii="Arial" w:cs="Arial" w:eastAsia="Arial" w:hAnsi="Arial"/>
+                <w:sz w:val="22"/>
+                <w:szCs w:val="22"/>
+                <w:rtl w:val="0"/>
+              </w:rPr>
+              <w:t xml:space="preserve">67 %</w:t>
+            </w:r>
+          </w:p>
+        </w:tc>
+      </w:tr>
+      <w:tr>
+        <w:tc>
+          <w:tcPr>
+            <w:tcW w:w="4680" w:type="dxa"/>
+            <w:vAlign w:val="center"/>
+          </w:tcPr>
+          <w:p>
+            <w:pPr>
+              <w:spacing w:after="40" w:before="40" w:lineRule="auto"/>
+              <w:jc w:val="left"/>
+              <w:rPr>
+                <w:rFonts w:ascii="Arial" w:cs="Arial" w:eastAsia="Arial" w:hAnsi="Arial"/>
+                <w:sz w:val="22"/>
+                <w:szCs w:val="22"/>
+              </w:rPr>
+            </w:pPr>
+            <w:r>
+              <w:rPr>
+                <w:rFonts w:ascii="Arial" w:cs="Arial" w:eastAsia="Arial" w:hAnsi="Arial"/>
+                <w:sz w:val="22"/>
+                <w:szCs w:val="22"/>
+                <w:rtl w:val="0"/>
+              </w:rPr>
+              <w:t xml:space="preserve">Si</w:t>
+            </w:r>
+          </w:p>
+        </w:tc>
+        <w:tc>
+          <w:tcPr>
+            <w:tcW w:w="2340" w:type="dxa"/>
+            <w:vAlign w:val="center"/>
+          </w:tcPr>
+          <w:p>
+            <w:pPr>
+              <w:spacing w:after="40" w:before="40" w:lineRule="auto"/>
+              <w:jc w:val="center"/>
+              <w:rPr>
+                <w:rFonts w:ascii="Arial" w:cs="Arial" w:eastAsia="Arial" w:hAnsi="Arial"/>
+                <w:sz w:val="22"/>
+                <w:szCs w:val="22"/>
+              </w:rPr>
+            </w:pPr>
+            <w:r>
+              <w:rPr>
+                <w:rFonts w:ascii="Arial" w:cs="Arial" w:eastAsia="Arial" w:hAnsi="Arial"/>
+                <w:sz w:val="22"/>
+                <w:szCs w:val="22"/>
+                <w:rtl w:val="0"/>
+              </w:rPr>
+              <w:t xml:space="preserve">10</w:t>
+            </w:r>
+          </w:p>
+        </w:tc>
+        <w:tc>
+          <w:tcPr>
+            <w:tcW w:w="2340" w:type="dxa"/>
+            <w:vAlign w:val="center"/>
+          </w:tcPr>
+          <w:p>
+            <w:pPr>
+              <w:spacing w:after="40" w:before="40" w:lineRule="auto"/>
+              <w:jc w:val="center"/>
+              <w:rPr>
+                <w:rFonts w:ascii="Arial" w:cs="Arial" w:eastAsia="Arial" w:hAnsi="Arial"/>
+                <w:sz w:val="22"/>
+                <w:szCs w:val="22"/>
+              </w:rPr>
+            </w:pPr>
+            <w:r>
+              <w:rPr>
+                <w:rFonts w:ascii="Arial" w:cs="Arial" w:eastAsia="Arial" w:hAnsi="Arial"/>
+                <w:sz w:val="22"/>
+                <w:szCs w:val="22"/>
+                <w:rtl w:val="0"/>
+              </w:rPr>
+              <w:t xml:space="preserve">33 %</w:t>
+            </w:r>
+          </w:p>
+        </w:tc>
+      </w:tr>
+      <w:tr>
+        <w:tc>
+          <w:tcPr>
+            <w:tcW w:w="4680" w:type="dxa"/>
+            <w:shd w:fill="F2F2F2" w:val="clear"/>
+            <w:vAlign w:val="center"/>
+          </w:tcPr>
+          <w:p>
+            <w:pPr>
+              <w:spacing w:after="40" w:before="40" w:lineRule="auto"/>
+              <w:jc w:val="left"/>
+              <w:rPr>
+                <w:rFonts w:ascii="Arial" w:cs="Arial" w:eastAsia="Arial" w:hAnsi="Arial"/>
+                <w:b w:val="1"/>
+                <w:bCs w:val="1"/>
+                <w:sz w:val="22"/>
+                <w:szCs w:val="22"/>
+              </w:rPr>
+            </w:pPr>
+            <w:r>
+              <w:rPr>
+                <w:rFonts w:ascii="Arial" w:cs="Arial" w:eastAsia="Arial" w:hAnsi="Arial"/>
+                <w:b w:val="1"/>
+                <w:bCs w:val="1"/>
+                <w:sz w:val="22"/>
+                <w:szCs w:val="22"/>
+                <w:rtl w:val="0"/>
+              </w:rPr>
+              <w:t xml:space="preserve">TOTAL</w:t>
+            </w:r>
+          </w:p>
+        </w:tc>
+        <w:tc>
+          <w:tcPr>
+            <w:tcW w:w="2340" w:type="dxa"/>
+            <w:shd w:fill="F2F2F2" w:val="clear"/>
+            <w:vAlign w:val="center"/>
+          </w:tcPr>
+          <w:p>
+            <w:pPr>
+              <w:spacing w:after="40" w:before="40" w:lineRule="auto"/>
+              <w:jc w:val="center"/>
+              <w:rPr>
+                <w:rFonts w:ascii="Arial" w:cs="Arial" w:eastAsia="Arial" w:hAnsi="Arial"/>
+                <w:b w:val="1"/>
+                <w:bCs w:val="1"/>
+                <w:sz w:val="22"/>
+                <w:szCs w:val="22"/>
+              </w:rPr>
+            </w:pPr>
+            <w:r>
+              <w:rPr>
+                <w:rFonts w:ascii="Arial" w:cs="Arial" w:eastAsia="Arial" w:hAnsi="Arial"/>
+                <w:b w:val="1"/>
+                <w:bCs w:val="1"/>
+                <w:sz w:val="22"/>
+                <w:szCs w:val="22"/>
+                <w:rtl w:val="0"/>
+              </w:rPr>
+              <w:t xml:space="preserve">30</w:t>
+            </w:r>
+          </w:p>
+        </w:tc>
+        <w:tc>
+          <w:tcPr>
+            <w:tcW w:w="2340" w:type="dxa"/>
+            <w:shd w:fill="F2F2F2" w:val="clear"/>
+            <w:vAlign w:val="center"/>
+          </w:tcPr>
+          <w:p>
+            <w:pPr>
+              <w:spacing w:after="40" w:before="40" w:lineRule="auto"/>
+              <w:jc w:val="center"/>
+              <w:rPr>
+                <w:rFonts w:ascii="Arial" w:cs="Arial" w:eastAsia="Arial" w:hAnsi="Arial"/>
+                <w:b w:val="1"/>
+                <w:bCs w:val="1"/>
+                <w:sz w:val="22"/>
+                <w:szCs w:val="22"/>
+              </w:rPr>
+            </w:pPr>
+            <w:r>
+              <w:rPr>
+                <w:rFonts w:ascii="Arial" w:cs="Arial" w:eastAsia="Arial" w:hAnsi="Arial"/>
+                <w:b w:val="1"/>
+                <w:bCs w:val="1"/>
+                <w:sz w:val="22"/>
+                <w:szCs w:val="22"/>
+                <w:rtl w:val="0"/>
+              </w:rPr>
+              <w:t xml:space="preserve">100 %</w:t>
+            </w:r>
+          </w:p>
+        </w:tc>
+      </w:tr>
+    </w:tbl>
+    <w:p>
+      <w:pPr>
+        <w:spacing w:after="0" w:before="0" w:lineRule="auto"/>
+        <w:rPr>
+          <w:rFonts w:ascii="Arial" w:cs="Arial" w:eastAsia="Arial" w:hAnsi="Arial"/>
+          <w:sz w:val="24"/>
+          <w:szCs w:val="24"/>
+        </w:rPr>
+      </w:pPr>
+    </w:p>
+    <w:p>
+      <w:pPr>
+        <w:spacing w:after="240" w:before="240" w:lineRule="auto"/>
+        <w:rPr>
+          <w:rFonts w:ascii="Arial" w:cs="Arial" w:eastAsia="Arial" w:hAnsi="Arial"/>
+          <w:b w:val="1"/>
+          <w:bCs w:val="1"/>
+          <w:sz w:val="22"/>
+          <w:szCs w:val="22"/>
+        </w:rPr>
+      </w:pPr>
+      <w:r>
+        <w:rPr>
+          <w:rFonts w:ascii="Arial" w:cs="Arial" w:eastAsia="Arial" w:hAnsi="Arial"/>
+          <w:b w:val="1"/>
+          <w:bCs w:val="1"/>
+          <w:sz w:val="22"/>
+          <w:szCs w:val="22"/>
+          <w:rtl w:val="0"/>
+        </w:rPr>
+        <w:t xml:space="preserve">Tabla 2. ¿Te gustaría probar Mochis sumergidos en nitrógeno liquido, con una experiencia de "humo" que da el nitrógeno liquido?</w:t>
+      </w:r>
+    </w:p>
+    <w:tbl>
+      <w:tblPr>
+        <w:tblStyle w:val="Tablanormal"/>
+        <w:tblW w:w="9360" w:type="dxa"/>
+        <w:jc w:val="left"/>
+        <w:tblBorders>
+          <w:top w:color="000000" w:space="0" w:sz="4" w:val="single"/>
+          <w:left w:color="000000" w:space="0" w:sz="4" w:val="single"/>
+          <w:bottom w:color="000000" w:space="0" w:sz="4" w:val="single"/>
+          <w:right w:color="000000" w:space="0" w:sz="4" w:val="single"/>
+          <w:insideH w:color="000000" w:space="0" w:sz="4" w:val="single"/>
+          <w:insideV w:color="000000" w:space="0" w:sz="4" w:val="single"/>
+        </w:tblBorders>
+        <w:tblLayout w:type="fixed"/>
+        <w:tblCellMar>
+          <w:top w:w="60" w:type="dxa"/>
+          <w:left w:w="108" w:type="dxa"/>
+          <w:bottom w:w="60" w:type="dxa"/>
+          <w:right w:w="108" w:type="dxa"/>
+        </w:tblCellMar>
+      </w:tblPr>
+      <w:tblGrid>
+        <w:gridCol w:w="4680"/>
+        <w:gridCol w:w="2340"/>
+        <w:gridCol w:w="2340"/>
+      </w:tblGrid>
+      <w:tr>
+        <w:trPr>
+          <w:tblHeader/>
+        </w:trPr>
+        <w:tc>
+          <w:tcPr>
+            <w:tcW w:w="4680" w:type="dxa"/>
+            <w:shd w:fill="D9D9D9" w:val="clear"/>
+            <w:vAlign w:val="center"/>
+          </w:tcPr>
+          <w:p>
+            <w:pPr>
+              <w:spacing w:after="40" w:before="40" w:lineRule="auto"/>
+              <w:jc w:val="left"/>
+              <w:rPr>
+                <w:rFonts w:ascii="Arial" w:cs="Arial" w:eastAsia="Arial" w:hAnsi="Arial"/>
+                <w:b w:val="1"/>
+                <w:bCs w:val="1"/>
+                <w:sz w:val="22"/>
+                <w:szCs w:val="22"/>
+              </w:rPr>
+            </w:pPr>
+            <w:r>
+              <w:rPr>
+                <w:rFonts w:ascii="Arial" w:cs="Arial" w:eastAsia="Arial" w:hAnsi="Arial"/>
+                <w:b w:val="1"/>
+                <w:bCs w:val="1"/>
+                <w:sz w:val="22"/>
+                <w:szCs w:val="22"/>
+                <w:rtl w:val="0"/>
+              </w:rPr>
+              <w:t xml:space="preserve">RESPUESTAS</w:t>
+            </w:r>
+          </w:p>
+        </w:tc>
+        <w:tc>
+          <w:tcPr>
+            <w:tcW w:w="2340" w:type="dxa"/>
+            <w:shd w:fill="D9D9D9" w:val="clear"/>
+            <w:vAlign w:val="center"/>
+          </w:tcPr>
+          <w:p>
+            <w:pPr>
+              <w:spacing w:after="40" w:before="40" w:lineRule="auto"/>
+              <w:jc w:val="center"/>
+              <w:rPr>
+                <w:rFonts w:ascii="Arial" w:cs="Arial" w:eastAsia="Arial" w:hAnsi="Arial"/>
+                <w:b w:val="1"/>
+                <w:bCs w:val="1"/>
+                <w:sz w:val="22"/>
+                <w:szCs w:val="22"/>
+              </w:rPr>
+            </w:pPr>
+            <w:r>
+              <w:rPr>
+                <w:rFonts w:ascii="Arial" w:cs="Arial" w:eastAsia="Arial" w:hAnsi="Arial"/>
+                <w:b w:val="1"/>
+                <w:bCs w:val="1"/>
+                <w:sz w:val="22"/>
+                <w:szCs w:val="22"/>
+                <w:rtl w:val="0"/>
+              </w:rPr>
+              <w:t xml:space="preserve">FRECUENCIAS</w:t>
+            </w:r>
+          </w:p>
+        </w:tc>
+        <w:tc>
+          <w:tcPr>
+            <w:tcW w:w="2340" w:type="dxa"/>
+            <w:shd w:fill="D9D9D9" w:val="clear"/>
+            <w:vAlign w:val="center"/>
+          </w:tcPr>
+          <w:p>
+            <w:pPr>
+              <w:spacing w:after="40" w:before="40" w:lineRule="auto"/>
+              <w:jc w:val="center"/>
+              <w:rPr>
+                <w:rFonts w:ascii="Arial" w:cs="Arial" w:eastAsia="Arial" w:hAnsi="Arial"/>
+                <w:b w:val="1"/>
+                <w:bCs w:val="1"/>
+                <w:sz w:val="22"/>
+                <w:szCs w:val="22"/>
+              </w:rPr>
+            </w:pPr>
+            <w:r>
+              <w:rPr>
+                <w:rFonts w:ascii="Arial" w:cs="Arial" w:eastAsia="Arial" w:hAnsi="Arial"/>
+                <w:b w:val="1"/>
+                <w:bCs w:val="1"/>
+                <w:sz w:val="22"/>
+                <w:szCs w:val="22"/>
+                <w:rtl w:val="0"/>
+              </w:rPr>
+              <w:t xml:space="preserve">%</w:t>
+            </w:r>
+          </w:p>
+        </w:tc>
+      </w:tr>
+      <w:tr>
+        <w:tc>
+          <w:tcPr>
+            <w:tcW w:w="4680" w:type="dxa"/>
+            <w:vAlign w:val="center"/>
+          </w:tcPr>
+          <w:p>
+            <w:pPr>
+              <w:spacing w:after="40" w:before="40" w:lineRule="auto"/>
+              <w:jc w:val="left"/>
+              <w:rPr>
+                <w:rFonts w:ascii="Arial" w:cs="Arial" w:eastAsia="Arial" w:hAnsi="Arial"/>
+                <w:sz w:val="22"/>
+                <w:szCs w:val="22"/>
+              </w:rPr>
+            </w:pPr>
+            <w:r>
+              <w:rPr>
+                <w:rFonts w:ascii="Arial" w:cs="Arial" w:eastAsia="Arial" w:hAnsi="Arial"/>
+                <w:sz w:val="22"/>
+                <w:szCs w:val="22"/>
+                <w:rtl w:val="0"/>
+              </w:rPr>
+              <w:t xml:space="preserve">Si</w:t>
+            </w:r>
+          </w:p>
+        </w:tc>
+        <w:tc>
+          <w:tcPr>
+            <w:tcW w:w="2340" w:type="dxa"/>
+            <w:vAlign w:val="center"/>
+          </w:tcPr>
+          <w:p>
+            <w:pPr>
+              <w:spacing w:after="40" w:before="40" w:lineRule="auto"/>
+              <w:jc w:val="center"/>
+              <w:rPr>
+                <w:rFonts w:ascii="Arial" w:cs="Arial" w:eastAsia="Arial" w:hAnsi="Arial"/>
+                <w:sz w:val="22"/>
+                <w:szCs w:val="22"/>
+              </w:rPr>
+            </w:pPr>
+            <w:r>
+              <w:rPr>
+                <w:rFonts w:ascii="Arial" w:cs="Arial" w:eastAsia="Arial" w:hAnsi="Arial"/>
+                <w:sz w:val="22"/>
+                <w:szCs w:val="22"/>
+                <w:rtl w:val="0"/>
+              </w:rPr>
+              <w:t xml:space="preserve">17</w:t>
+            </w:r>
+          </w:p>
+        </w:tc>
+        <w:tc>
+          <w:tcPr>
+            <w:tcW w:w="2340" w:type="dxa"/>
+            <w:vAlign w:val="center"/>
+          </w:tcPr>
+          <w:p>
+            <w:pPr>
+              <w:spacing w:after="40" w:before="40" w:lineRule="auto"/>
+              <w:jc w:val="center"/>
+              <w:rPr>
+                <w:rFonts w:ascii="Arial" w:cs="Arial" w:eastAsia="Arial" w:hAnsi="Arial"/>
+                <w:sz w:val="22"/>
+                <w:szCs w:val="22"/>
+              </w:rPr>
+            </w:pPr>
+            <w:r>
+              <w:rPr>
+                <w:rFonts w:ascii="Arial" w:cs="Arial" w:eastAsia="Arial" w:hAnsi="Arial"/>
+                <w:sz w:val="22"/>
+                <w:szCs w:val="22"/>
+                <w:rtl w:val="0"/>
+              </w:rPr>
+              <w:t xml:space="preserve">57 %</w:t>
+            </w:r>
+          </w:p>
+        </w:tc>
+      </w:tr>
+      <w:tr>
+        <w:tc>
+          <w:tcPr>
+            <w:tcW w:w="4680" w:type="dxa"/>
+            <w:vAlign w:val="center"/>
+          </w:tcPr>
+          <w:p>
+            <w:pPr>
+              <w:spacing w:after="40" w:before="40" w:lineRule="auto"/>
+              <w:jc w:val="left"/>
+              <w:rPr>
+                <w:rFonts w:ascii="Arial" w:cs="Arial" w:eastAsia="Arial" w:hAnsi="Arial"/>
+                <w:sz w:val="22"/>
+                <w:szCs w:val="22"/>
+              </w:rPr>
+            </w:pPr>
+            <w:r>
+              <w:rPr>
+                <w:rFonts w:ascii="Arial" w:cs="Arial" w:eastAsia="Arial" w:hAnsi="Arial"/>
+                <w:sz w:val="22"/>
+                <w:szCs w:val="22"/>
+                <w:rtl w:val="0"/>
+              </w:rPr>
+              <w:t xml:space="preserve">No</w:t>
+            </w:r>
+          </w:p>
+        </w:tc>
+        <w:tc>
+          <w:tcPr>
+            <w:tcW w:w="2340" w:type="dxa"/>
+            <w:vAlign w:val="center"/>
+          </w:tcPr>
+          <w:p>
+            <w:pPr>
+              <w:spacing w:after="40" w:before="40" w:lineRule="auto"/>
+              <w:jc w:val="center"/>
+              <w:rPr>
+                <w:rFonts w:ascii="Arial" w:cs="Arial" w:eastAsia="Arial" w:hAnsi="Arial"/>
+                <w:sz w:val="22"/>
+                <w:szCs w:val="22"/>
+              </w:rPr>
+            </w:pPr>
+            <w:r>
+              <w:rPr>
+                <w:rFonts w:ascii="Arial" w:cs="Arial" w:eastAsia="Arial" w:hAnsi="Arial"/>
+                <w:sz w:val="22"/>
+                <w:szCs w:val="22"/>
+                <w:rtl w:val="0"/>
+              </w:rPr>
+              <w:t xml:space="preserve">8</w:t>
+            </w:r>
+          </w:p>
+        </w:tc>
+        <w:tc>
+          <w:tcPr>
+            <w:tcW w:w="2340" w:type="dxa"/>
+            <w:vAlign w:val="center"/>
+          </w:tcPr>
+          <w:p>
+            <w:pPr>
+              <w:spacing w:after="40" w:before="40" w:lineRule="auto"/>
+              <w:jc w:val="center"/>
+              <w:rPr>
+                <w:rFonts w:ascii="Arial" w:cs="Arial" w:eastAsia="Arial" w:hAnsi="Arial"/>
+                <w:sz w:val="22"/>
+                <w:szCs w:val="22"/>
+              </w:rPr>
+            </w:pPr>
+            <w:r>
+              <w:rPr>
+                <w:rFonts w:ascii="Arial" w:cs="Arial" w:eastAsia="Arial" w:hAnsi="Arial"/>
+                <w:sz w:val="22"/>
+                <w:szCs w:val="22"/>
+                <w:rtl w:val="0"/>
+              </w:rPr>
+              <w:t xml:space="preserve">27 %</w:t>
+            </w:r>
+          </w:p>
+        </w:tc>
+      </w:tr>
+      <w:tr>
+        <w:tc>
+          <w:tcPr>
+            <w:tcW w:w="4680" w:type="dxa"/>
+            <w:vAlign w:val="center"/>
+          </w:tcPr>
+          <w:p>
+            <w:pPr>
+              <w:spacing w:after="40" w:before="40" w:lineRule="auto"/>
+              <w:jc w:val="left"/>
+              <w:rPr>
+                <w:rFonts w:ascii="Arial" w:cs="Arial" w:eastAsia="Arial" w:hAnsi="Arial"/>
+                <w:sz w:val="22"/>
+                <w:szCs w:val="22"/>
+              </w:rPr>
+            </w:pPr>
+            <w:r>
+              <w:rPr>
+                <w:rFonts w:ascii="Arial" w:cs="Arial" w:eastAsia="Arial" w:hAnsi="Arial"/>
+                <w:sz w:val="22"/>
+                <w:szCs w:val="22"/>
+                <w:rtl w:val="0"/>
+              </w:rPr>
+              <w:t xml:space="preserve">No por que siento que seria peligroso</w:t>
+            </w:r>
+          </w:p>
+        </w:tc>
+        <w:tc>
+          <w:tcPr>
+            <w:tcW w:w="2340" w:type="dxa"/>
+            <w:vAlign w:val="center"/>
+          </w:tcPr>
+          <w:p>
+            <w:pPr>
+              <w:spacing w:after="40" w:before="40" w:lineRule="auto"/>
+              <w:jc w:val="center"/>
+              <w:rPr>
+                <w:rFonts w:ascii="Arial" w:cs="Arial" w:eastAsia="Arial" w:hAnsi="Arial"/>
+                <w:sz w:val="22"/>
+                <w:szCs w:val="22"/>
+              </w:rPr>
+            </w:pPr>
+            <w:r>
+              <w:rPr>
+                <w:rFonts w:ascii="Arial" w:cs="Arial" w:eastAsia="Arial" w:hAnsi="Arial"/>
+                <w:sz w:val="22"/>
+                <w:szCs w:val="22"/>
+                <w:rtl w:val="0"/>
+              </w:rPr>
+              <w:t xml:space="preserve">5</w:t>
+            </w:r>
+          </w:p>
+        </w:tc>
+        <w:tc>
+          <w:tcPr>
+            <w:tcW w:w="2340" w:type="dxa"/>
+            <w:vAlign w:val="center"/>
+          </w:tcPr>
+          <w:p>
+            <w:pPr>
+              <w:spacing w:after="40" w:before="40" w:lineRule="auto"/>
+              <w:jc w:val="center"/>
+              <w:rPr>
+                <w:rFonts w:ascii="Arial" w:cs="Arial" w:eastAsia="Arial" w:hAnsi="Arial"/>
+                <w:sz w:val="22"/>
+                <w:szCs w:val="22"/>
+              </w:rPr>
+            </w:pPr>
+            <w:r>
+              <w:rPr>
+                <w:rFonts w:ascii="Arial" w:cs="Arial" w:eastAsia="Arial" w:hAnsi="Arial"/>
+                <w:sz w:val="22"/>
+                <w:szCs w:val="22"/>
+                <w:rtl w:val="0"/>
+              </w:rPr>
+              <w:t xml:space="preserve">17 %</w:t>
+            </w:r>
+          </w:p>
+        </w:tc>
+      </w:tr>
+      <w:tr>
+        <w:tc>
+          <w:tcPr>
+            <w:tcW w:w="4680" w:type="dxa"/>
+            <w:shd w:fill="F2F2F2" w:val="clear"/>
+            <w:vAlign w:val="center"/>
+          </w:tcPr>
+          <w:p>
+            <w:pPr>
+              <w:spacing w:after="40" w:before="40" w:lineRule="auto"/>
+              <w:jc w:val="left"/>
+              <w:rPr>
+                <w:rFonts w:ascii="Arial" w:cs="Arial" w:eastAsia="Arial" w:hAnsi="Arial"/>
+                <w:b w:val="1"/>
+                <w:bCs w:val="1"/>
+                <w:sz w:val="22"/>
+                <w:szCs w:val="22"/>
+              </w:rPr>
+            </w:pPr>
+            <w:r>
+              <w:rPr>
+                <w:rFonts w:ascii="Arial" w:cs="Arial" w:eastAsia="Arial" w:hAnsi="Arial"/>
+                <w:b w:val="1"/>
+                <w:bCs w:val="1"/>
+                <w:sz w:val="22"/>
+                <w:szCs w:val="22"/>
+                <w:rtl w:val="0"/>
+              </w:rPr>
+              <w:t xml:space="preserve">TOTAL</w:t>
+            </w:r>
+          </w:p>
+        </w:tc>
+        <w:tc>
+          <w:tcPr>
+            <w:tcW w:w="2340" w:type="dxa"/>
+            <w:shd w:fill="F2F2F2" w:val="clear"/>
+            <w:vAlign w:val="center"/>
+          </w:tcPr>
+          <w:p>
+            <w:pPr>
+              <w:spacing w:after="40" w:before="40" w:lineRule="auto"/>
+              <w:jc w:val="center"/>
+              <w:rPr>
+                <w:rFonts w:ascii="Arial" w:cs="Arial" w:eastAsia="Arial" w:hAnsi="Arial"/>
+                <w:b w:val="1"/>
+                <w:bCs w:val="1"/>
+                <w:sz w:val="22"/>
+                <w:szCs w:val="22"/>
+              </w:rPr>
+            </w:pPr>
+            <w:r>
+              <w:rPr>
+                <w:rFonts w:ascii="Arial" w:cs="Arial" w:eastAsia="Arial" w:hAnsi="Arial"/>
+                <w:b w:val="1"/>
+                <w:bCs w:val="1"/>
+                <w:sz w:val="22"/>
+                <w:szCs w:val="22"/>
+                <w:rtl w:val="0"/>
+              </w:rPr>
+              <w:t xml:space="preserve">30</w:t>
+            </w:r>
+          </w:p>
+        </w:tc>
+        <w:tc>
+          <w:tcPr>
+            <w:tcW w:w="2340" w:type="dxa"/>
+            <w:shd w:fill="F2F2F2" w:val="clear"/>
+            <w:vAlign w:val="center"/>
+          </w:tcPr>
+          <w:p>
+            <w:pPr>
+              <w:spacing w:after="40" w:before="40" w:lineRule="auto"/>
+              <w:jc w:val="center"/>
+              <w:rPr>
+                <w:rFonts w:ascii="Arial" w:cs="Arial" w:eastAsia="Arial" w:hAnsi="Arial"/>
+                <w:b w:val="1"/>
+                <w:bCs w:val="1"/>
+                <w:sz w:val="22"/>
+                <w:szCs w:val="22"/>
+              </w:rPr>
+            </w:pPr>
+            <w:r>
+              <w:rPr>
+                <w:rFonts w:ascii="Arial" w:cs="Arial" w:eastAsia="Arial" w:hAnsi="Arial"/>
+                <w:b w:val="1"/>
+                <w:bCs w:val="1"/>
+                <w:sz w:val="22"/>
+                <w:szCs w:val="22"/>
+                <w:rtl w:val="0"/>
+              </w:rPr>
+              <w:t xml:space="preserve">101 %</w:t>
+            </w:r>
+          </w:p>
+        </w:tc>
+      </w:tr>
+    </w:tbl>
+    <w:p>
+      <w:pPr>
+        <w:spacing w:after="0" w:before="0" w:lineRule="auto"/>
+        <w:rPr>
+          <w:rFonts w:ascii="Arial" w:cs="Arial" w:eastAsia="Arial" w:hAnsi="Arial"/>
+          <w:sz w:val="24"/>
+          <w:szCs w:val="24"/>
+        </w:rPr>
+      </w:pPr>
+    </w:p>
+    <w:p>
+      <w:pPr>
+        <w:spacing w:after="240" w:before="240" w:lineRule="auto"/>
+        <w:rPr>
+          <w:rFonts w:ascii="Arial" w:cs="Arial" w:eastAsia="Arial" w:hAnsi="Arial"/>
+          <w:b w:val="1"/>
+          <w:bCs w:val="1"/>
+          <w:sz w:val="22"/>
+          <w:szCs w:val="22"/>
+        </w:rPr>
+      </w:pPr>
+      <w:r>
+        <w:rPr>
+          <w:rFonts w:ascii="Arial" w:cs="Arial" w:eastAsia="Arial" w:hAnsi="Arial"/>
+          <w:b w:val="1"/>
+          <w:bCs w:val="1"/>
+          <w:sz w:val="22"/>
+          <w:szCs w:val="22"/>
+          <w:rtl w:val="0"/>
+        </w:rPr>
+        <w:t xml:space="preserve">Tabla 3. ¿Probarías un Mochi recién sumergido en el nitrógeno liquido sin esperar indicaciones?</w:t>
+      </w:r>
+    </w:p>
+    <w:tbl>
+      <w:tblPr>
+        <w:tblStyle w:val="Tablanormal"/>
+        <w:tblW w:w="9360" w:type="dxa"/>
+        <w:jc w:val="left"/>
+        <w:tblBorders>
+          <w:top w:color="000000" w:space="0" w:sz="4" w:val="single"/>
+          <w:left w:color="000000" w:space="0" w:sz="4" w:val="single"/>
+          <w:bottom w:color="000000" w:space="0" w:sz="4" w:val="single"/>
+          <w:right w:color="000000" w:space="0" w:sz="4" w:val="single"/>
+          <w:insideH w:color="000000" w:space="0" w:sz="4" w:val="single"/>
+          <w:insideV w:color="000000" w:space="0" w:sz="4" w:val="single"/>
+        </w:tblBorders>
+        <w:tblLayout w:type="fixed"/>
+        <w:tblCellMar>
+          <w:top w:w="60" w:type="dxa"/>
+          <w:left w:w="108" w:type="dxa"/>
+          <w:bottom w:w="60" w:type="dxa"/>
+          <w:right w:w="108" w:type="dxa"/>
+        </w:tblCellMar>
+      </w:tblPr>
+      <w:tblGrid>
+        <w:gridCol w:w="4680"/>
+        <w:gridCol w:w="2340"/>
+        <w:gridCol w:w="2340"/>
+      </w:tblGrid>
+      <w:tr>
+        <w:trPr>
+          <w:tblHeader/>
+        </w:trPr>
+        <w:tc>
+          <w:tcPr>
+            <w:tcW w:w="4680" w:type="dxa"/>
+            <w:shd w:fill="D9D9D9" w:val="clear"/>
+            <w:vAlign w:val="center"/>
+          </w:tcPr>
+          <w:p>
+            <w:pPr>
+              <w:spacing w:after="40" w:before="40" w:lineRule="auto"/>
+              <w:jc w:val="left"/>
+              <w:rPr>
+                <w:rFonts w:ascii="Arial" w:cs="Arial" w:eastAsia="Arial" w:hAnsi="Arial"/>
+                <w:b w:val="1"/>
+                <w:bCs w:val="1"/>
+                <w:sz w:val="22"/>
+                <w:szCs w:val="22"/>
+              </w:rPr>
+            </w:pPr>
+            <w:r>
+              <w:rPr>
+                <w:rFonts w:ascii="Arial" w:cs="Arial" w:eastAsia="Arial" w:hAnsi="Arial"/>
+                <w:b w:val="1"/>
+                <w:bCs w:val="1"/>
+                <w:sz w:val="22"/>
+                <w:szCs w:val="22"/>
+                <w:rtl w:val="0"/>
+              </w:rPr>
+              <w:t xml:space="preserve">RESPUESTAS</w:t>
+            </w:r>
+          </w:p>
+        </w:tc>
+        <w:tc>
+          <w:tcPr>
+            <w:tcW w:w="2340" w:type="dxa"/>
+            <w:shd w:fill="D9D9D9" w:val="clear"/>
+            <w:vAlign w:val="center"/>
+          </w:tcPr>
+          <w:p>
+            <w:pPr>
+              <w:spacing w:after="40" w:before="40" w:lineRule="auto"/>
+              <w:jc w:val="center"/>
+              <w:rPr>
+                <w:rFonts w:ascii="Arial" w:cs="Arial" w:eastAsia="Arial" w:hAnsi="Arial"/>
+                <w:b w:val="1"/>
+                <w:bCs w:val="1"/>
+                <w:sz w:val="22"/>
+                <w:szCs w:val="22"/>
+              </w:rPr>
+            </w:pPr>
+            <w:r>
+              <w:rPr>
+                <w:rFonts w:ascii="Arial" w:cs="Arial" w:eastAsia="Arial" w:hAnsi="Arial"/>
+                <w:b w:val="1"/>
+                <w:bCs w:val="1"/>
+                <w:sz w:val="22"/>
+                <w:szCs w:val="22"/>
+                <w:rtl w:val="0"/>
+              </w:rPr>
+              <w:t xml:space="preserve">FRECUENCIAS</w:t>
+            </w:r>
+          </w:p>
+        </w:tc>
+        <w:tc>
+          <w:tcPr>
+            <w:tcW w:w="2340" w:type="dxa"/>
+            <w:shd w:fill="D9D9D9" w:val="clear"/>
+            <w:vAlign w:val="center"/>
+          </w:tcPr>
+          <w:p>
+            <w:pPr>
+              <w:spacing w:after="40" w:before="40" w:lineRule="auto"/>
+              <w:jc w:val="center"/>
+              <w:rPr>
+                <w:rFonts w:ascii="Arial" w:cs="Arial" w:eastAsia="Arial" w:hAnsi="Arial"/>
+                <w:b w:val="1"/>
+                <w:bCs w:val="1"/>
+                <w:sz w:val="22"/>
+                <w:szCs w:val="22"/>
+              </w:rPr>
+            </w:pPr>
+            <w:r>
+              <w:rPr>
+                <w:rFonts w:ascii="Arial" w:cs="Arial" w:eastAsia="Arial" w:hAnsi="Arial"/>
+                <w:b w:val="1"/>
+                <w:bCs w:val="1"/>
+                <w:sz w:val="22"/>
+                <w:szCs w:val="22"/>
+                <w:rtl w:val="0"/>
+              </w:rPr>
+              <w:t xml:space="preserve">%</w:t>
+            </w:r>
+          </w:p>
+        </w:tc>
+      </w:tr>
+      <w:tr>
+        <w:tc>
+          <w:tcPr>
+            <w:tcW w:w="4680" w:type="dxa"/>
+            <w:vAlign w:val="center"/>
+          </w:tcPr>
+          <w:p>
+            <w:pPr>
+              <w:spacing w:after="40" w:before="40" w:lineRule="auto"/>
+              <w:jc w:val="left"/>
+              <w:rPr>
+                <w:rFonts w:ascii="Arial" w:cs="Arial" w:eastAsia="Arial" w:hAnsi="Arial"/>
+                <w:sz w:val="22"/>
+                <w:szCs w:val="22"/>
+              </w:rPr>
+            </w:pPr>
+            <w:r>
+              <w:rPr>
+                <w:rFonts w:ascii="Arial" w:cs="Arial" w:eastAsia="Arial" w:hAnsi="Arial"/>
+                <w:sz w:val="22"/>
+                <w:szCs w:val="22"/>
+                <w:rtl w:val="0"/>
+              </w:rPr>
+              <w:t xml:space="preserve">No</w:t>
+            </w:r>
+          </w:p>
+        </w:tc>
+        <w:tc>
+          <w:tcPr>
+            <w:tcW w:w="2340" w:type="dxa"/>
+            <w:vAlign w:val="center"/>
+          </w:tcPr>
+          <w:p>
+            <w:pPr>
+              <w:spacing w:after="40" w:before="40" w:lineRule="auto"/>
+              <w:jc w:val="center"/>
+              <w:rPr>
+                <w:rFonts w:ascii="Arial" w:cs="Arial" w:eastAsia="Arial" w:hAnsi="Arial"/>
+                <w:sz w:val="22"/>
+                <w:szCs w:val="22"/>
+              </w:rPr>
+            </w:pPr>
+            <w:r>
+              <w:rPr>
+                <w:rFonts w:ascii="Arial" w:cs="Arial" w:eastAsia="Arial" w:hAnsi="Arial"/>
+                <w:sz w:val="22"/>
+                <w:szCs w:val="22"/>
+                <w:rtl w:val="0"/>
+              </w:rPr>
+              <w:t xml:space="preserve">15</w:t>
+            </w:r>
+          </w:p>
+        </w:tc>
+        <w:tc>
+          <w:tcPr>
+            <w:tcW w:w="2340" w:type="dxa"/>
+            <w:vAlign w:val="center"/>
+          </w:tcPr>
+          <w:p>
+            <w:pPr>
+              <w:spacing w:after="40" w:before="40" w:lineRule="auto"/>
+              <w:jc w:val="center"/>
+              <w:rPr>
+                <w:rFonts w:ascii="Arial" w:cs="Arial" w:eastAsia="Arial" w:hAnsi="Arial"/>
+                <w:sz w:val="22"/>
+                <w:szCs w:val="22"/>
+              </w:rPr>
+            </w:pPr>
+            <w:r>
+              <w:rPr>
+                <w:rFonts w:ascii="Arial" w:cs="Arial" w:eastAsia="Arial" w:hAnsi="Arial"/>
+                <w:sz w:val="22"/>
+                <w:szCs w:val="22"/>
+                <w:rtl w:val="0"/>
+              </w:rPr>
+              <w:t xml:space="preserve">50 %</w:t>
+            </w:r>
+          </w:p>
+        </w:tc>
+      </w:tr>
+      <w:tr>
+        <w:tc>
+          <w:tcPr>
+            <w:tcW w:w="4680" w:type="dxa"/>
+            <w:vAlign w:val="center"/>
+          </w:tcPr>
+          <w:p>
+            <w:pPr>
+              <w:spacing w:after="40" w:before="40" w:lineRule="auto"/>
+              <w:jc w:val="left"/>
+              <w:rPr>
+                <w:rFonts w:ascii="Arial" w:cs="Arial" w:eastAsia="Arial" w:hAnsi="Arial"/>
+                <w:sz w:val="22"/>
+                <w:szCs w:val="22"/>
+              </w:rPr>
+            </w:pPr>
+            <w:r>
+              <w:rPr>
+                <w:rFonts w:ascii="Arial" w:cs="Arial" w:eastAsia="Arial" w:hAnsi="Arial"/>
+                <w:sz w:val="22"/>
+                <w:szCs w:val="22"/>
+                <w:rtl w:val="0"/>
+              </w:rPr>
+              <w:t xml:space="preserve">Si</w:t>
+            </w:r>
+          </w:p>
+        </w:tc>
+        <w:tc>
+          <w:tcPr>
+            <w:tcW w:w="2340" w:type="dxa"/>
+            <w:vAlign w:val="center"/>
+          </w:tcPr>
+          <w:p>
+            <w:pPr>
+              <w:spacing w:after="40" w:before="40" w:lineRule="auto"/>
+              <w:jc w:val="center"/>
+              <w:rPr>
+                <w:rFonts w:ascii="Arial" w:cs="Arial" w:eastAsia="Arial" w:hAnsi="Arial"/>
+                <w:sz w:val="22"/>
+                <w:szCs w:val="22"/>
+              </w:rPr>
+            </w:pPr>
+            <w:r>
+              <w:rPr>
+                <w:rFonts w:ascii="Arial" w:cs="Arial" w:eastAsia="Arial" w:hAnsi="Arial"/>
+                <w:sz w:val="22"/>
+                <w:szCs w:val="22"/>
+                <w:rtl w:val="0"/>
+              </w:rPr>
+              <w:t xml:space="preserve">14</w:t>
+            </w:r>
+          </w:p>
+        </w:tc>
+        <w:tc>
+          <w:tcPr>
+            <w:tcW w:w="2340" w:type="dxa"/>
+            <w:vAlign w:val="center"/>
+          </w:tcPr>
+          <w:p>
+            <w:pPr>
+              <w:spacing w:after="40" w:before="40" w:lineRule="auto"/>
+              <w:jc w:val="center"/>
+              <w:rPr>
+                <w:rFonts w:ascii="Arial" w:cs="Arial" w:eastAsia="Arial" w:hAnsi="Arial"/>
+                <w:sz w:val="22"/>
+                <w:szCs w:val="22"/>
+              </w:rPr>
+            </w:pPr>
+            <w:r>
+              <w:rPr>
+                <w:rFonts w:ascii="Arial" w:cs="Arial" w:eastAsia="Arial" w:hAnsi="Arial"/>
+                <w:sz w:val="22"/>
+                <w:szCs w:val="22"/>
+                <w:rtl w:val="0"/>
+              </w:rPr>
+              <w:t xml:space="preserve">47 %</w:t>
+            </w:r>
+          </w:p>
+        </w:tc>
+      </w:tr>
+      <w:tr>
+        <w:tc>
+          <w:tcPr>
+            <w:tcW w:w="4680" w:type="dxa"/>
+            <w:vAlign w:val="center"/>
+          </w:tcPr>
+          <w:p>
+            <w:pPr>
+              <w:spacing w:after="40" w:before="40" w:lineRule="auto"/>
+              <w:jc w:val="left"/>
+              <w:rPr>
+                <w:rFonts w:ascii="Arial" w:cs="Arial" w:eastAsia="Arial" w:hAnsi="Arial"/>
+                <w:sz w:val="22"/>
+                <w:szCs w:val="22"/>
+              </w:rPr>
+            </w:pPr>
+            <w:r>
+              <w:rPr>
+                <w:rFonts w:ascii="Arial" w:cs="Arial" w:eastAsia="Arial" w:hAnsi="Arial"/>
+                <w:sz w:val="22"/>
+                <w:szCs w:val="22"/>
+                <w:rtl w:val="0"/>
+              </w:rPr>
+              <w:t xml:space="preserve">Opción 3</w:t>
+            </w:r>
+          </w:p>
+        </w:tc>
+        <w:tc>
+          <w:tcPr>
+            <w:tcW w:w="2340" w:type="dxa"/>
+            <w:vAlign w:val="center"/>
+          </w:tcPr>
+          <w:p>
+            <w:pPr>
+              <w:spacing w:after="40" w:before="40" w:lineRule="auto"/>
+              <w:jc w:val="center"/>
+              <w:rPr>
+                <w:rFonts w:ascii="Arial" w:cs="Arial" w:eastAsia="Arial" w:hAnsi="Arial"/>
+                <w:sz w:val="22"/>
+                <w:szCs w:val="22"/>
+              </w:rPr>
+            </w:pPr>
+            <w:r>
+              <w:rPr>
+                <w:rFonts w:ascii="Arial" w:cs="Arial" w:eastAsia="Arial" w:hAnsi="Arial"/>
+                <w:sz w:val="22"/>
+                <w:szCs w:val="22"/>
+                <w:rtl w:val="0"/>
+              </w:rPr>
+              <w:t xml:space="preserve">1</w:t>
+            </w:r>
+          </w:p>
+        </w:tc>
+        <w:tc>
+          <w:tcPr>
+            <w:tcW w:w="2340" w:type="dxa"/>
+            <w:vAlign w:val="center"/>
+          </w:tcPr>
+          <w:p>
+            <w:pPr>
+              <w:spacing w:after="40" w:before="40" w:lineRule="auto"/>
+              <w:jc w:val="center"/>
+              <w:rPr>
+                <w:rFonts w:ascii="Arial" w:cs="Arial" w:eastAsia="Arial" w:hAnsi="Arial"/>
+                <w:sz w:val="22"/>
+                <w:szCs w:val="22"/>
+              </w:rPr>
+            </w:pPr>
+            <w:r>
+              <w:rPr>
+                <w:rFonts w:ascii="Arial" w:cs="Arial" w:eastAsia="Arial" w:hAnsi="Arial"/>
+                <w:sz w:val="22"/>
+                <w:szCs w:val="22"/>
+                <w:rtl w:val="0"/>
+              </w:rPr>
+              <w:t xml:space="preserve">3 %</w:t>
+            </w:r>
+          </w:p>
+        </w:tc>
+      </w:tr>
+      <w:tr>
+        <w:tc>
+          <w:tcPr>
+            <w:tcW w:w="4680" w:type="dxa"/>
+            <w:shd w:fill="F2F2F2" w:val="clear"/>
+            <w:vAlign w:val="center"/>
+          </w:tcPr>
+          <w:p>
+            <w:pPr>
+              <w:spacing w:after="40" w:before="40" w:lineRule="auto"/>
+              <w:jc w:val="left"/>
+              <w:rPr>
+                <w:rFonts w:ascii="Arial" w:cs="Arial" w:eastAsia="Arial" w:hAnsi="Arial"/>
+                <w:b w:val="1"/>
+                <w:bCs w:val="1"/>
+                <w:sz w:val="22"/>
+                <w:szCs w:val="22"/>
+              </w:rPr>
+            </w:pPr>
+            <w:r>
+              <w:rPr>
+                <w:rFonts w:ascii="Arial" w:cs="Arial" w:eastAsia="Arial" w:hAnsi="Arial"/>
+                <w:b w:val="1"/>
+                <w:bCs w:val="1"/>
+                <w:sz w:val="22"/>
+                <w:szCs w:val="22"/>
+                <w:rtl w:val="0"/>
+              </w:rPr>
+              <w:t xml:space="preserve">TOTAL</w:t>
+            </w:r>
+          </w:p>
+        </w:tc>
+        <w:tc>
+          <w:tcPr>
+            <w:tcW w:w="2340" w:type="dxa"/>
+            <w:shd w:fill="F2F2F2" w:val="clear"/>
+            <w:vAlign w:val="center"/>
+          </w:tcPr>
+          <w:p>
+            <w:pPr>
+              <w:spacing w:after="40" w:before="40" w:lineRule="auto"/>
+              <w:jc w:val="center"/>
+              <w:rPr>
+                <w:rFonts w:ascii="Arial" w:cs="Arial" w:eastAsia="Arial" w:hAnsi="Arial"/>
+                <w:b w:val="1"/>
+                <w:bCs w:val="1"/>
+                <w:sz w:val="22"/>
+                <w:szCs w:val="22"/>
+              </w:rPr>
+            </w:pPr>
+            <w:r>
+              <w:rPr>
+                <w:rFonts w:ascii="Arial" w:cs="Arial" w:eastAsia="Arial" w:hAnsi="Arial"/>
+                <w:b w:val="1"/>
+                <w:bCs w:val="1"/>
+                <w:sz w:val="22"/>
+                <w:szCs w:val="22"/>
+                <w:rtl w:val="0"/>
+              </w:rPr>
+              <w:t xml:space="preserve">30</w:t>
+            </w:r>
+          </w:p>
+        </w:tc>
+        <w:tc>
+          <w:tcPr>
+            <w:tcW w:w="2340" w:type="dxa"/>
+            <w:shd w:fill="F2F2F2" w:val="clear"/>
+            <w:vAlign w:val="center"/>
+          </w:tcPr>
+          <w:p>
+            <w:pPr>
+              <w:spacing w:after="40" w:before="40" w:lineRule="auto"/>
+              <w:jc w:val="center"/>
+              <w:rPr>
+                <w:rFonts w:ascii="Arial" w:cs="Arial" w:eastAsia="Arial" w:hAnsi="Arial"/>
+                <w:b w:val="1"/>
+                <w:bCs w:val="1"/>
+                <w:sz w:val="22"/>
+                <w:szCs w:val="22"/>
+              </w:rPr>
+            </w:pPr>
+            <w:r>
+              <w:rPr>
+                <w:rFonts w:ascii="Arial" w:cs="Arial" w:eastAsia="Arial" w:hAnsi="Arial"/>
+                <w:b w:val="1"/>
+                <w:bCs w:val="1"/>
+                <w:sz w:val="22"/>
+                <w:szCs w:val="22"/>
+                <w:rtl w:val="0"/>
+              </w:rPr>
+              <w:t xml:space="preserve">100 %</w:t>
+            </w:r>
+          </w:p>
+        </w:tc>
+      </w:tr>
+    </w:tbl>
+    <w:p>
+      <w:pPr>
+        <w:spacing w:after="0" w:before="0" w:lineRule="auto"/>
+        <w:rPr>
+          <w:rFonts w:ascii="Arial" w:cs="Arial" w:eastAsia="Arial" w:hAnsi="Arial"/>
+          <w:sz w:val="24"/>
+          <w:szCs w:val="24"/>
+        </w:rPr>
+      </w:pPr>
+    </w:p>
+    <w:p>
+      <w:pPr>
+        <w:spacing w:after="240" w:before="240" w:lineRule="auto"/>
+        <w:rPr>
+          <w:rFonts w:ascii="Arial" w:cs="Arial" w:eastAsia="Arial" w:hAnsi="Arial"/>
+          <w:b w:val="1"/>
+          <w:bCs w:val="1"/>
+          <w:sz w:val="22"/>
+          <w:szCs w:val="22"/>
+        </w:rPr>
+      </w:pPr>
+      <w:r>
+        <w:rPr>
+          <w:rFonts w:ascii="Arial" w:cs="Arial" w:eastAsia="Arial" w:hAnsi="Arial"/>
+          <w:b w:val="1"/>
+          <w:bCs w:val="1"/>
+          <w:sz w:val="22"/>
+          <w:szCs w:val="22"/>
+          <w:rtl w:val="0"/>
+        </w:rPr>
+        <w:t xml:space="preserve">Tabla 4. ¿Consideras importante recibir instrucciones del consumo del nitrógeno liquido antes de probarlo?</w:t>
+      </w:r>
+    </w:p>
+    <w:tbl>
+      <w:tblPr>
+        <w:tblStyle w:val="Tablanormal"/>
+        <w:tblW w:w="9360" w:type="dxa"/>
+        <w:jc w:val="left"/>
+        <w:tblBorders>
+          <w:top w:color="000000" w:space="0" w:sz="4" w:val="single"/>
+          <w:left w:color="000000" w:space="0" w:sz="4" w:val="single"/>
+          <w:bottom w:color="000000" w:space="0" w:sz="4" w:val="single"/>
+          <w:right w:color="000000" w:space="0" w:sz="4" w:val="single"/>
+          <w:insideH w:color="000000" w:space="0" w:sz="4" w:val="single"/>
+          <w:insideV w:color="000000" w:space="0" w:sz="4" w:val="single"/>
+        </w:tblBorders>
+        <w:tblLayout w:type="fixed"/>
+        <w:tblCellMar>
+          <w:top w:w="60" w:type="dxa"/>
+          <w:left w:w="108" w:type="dxa"/>
+          <w:bottom w:w="60" w:type="dxa"/>
+          <w:right w:w="108" w:type="dxa"/>
+        </w:tblCellMar>
+      </w:tblPr>
+      <w:tblGrid>
+        <w:gridCol w:w="4680"/>
+        <w:gridCol w:w="2340"/>
+        <w:gridCol w:w="2340"/>
+      </w:tblGrid>
+      <w:tr>
+        <w:trPr>
+          <w:tblHeader/>
+        </w:trPr>
+        <w:tc>
+          <w:tcPr>
+            <w:tcW w:w="4680" w:type="dxa"/>
+            <w:shd w:fill="D9D9D9" w:val="clear"/>
+            <w:vAlign w:val="center"/>
+          </w:tcPr>
+          <w:p>
+            <w:pPr>
+              <w:spacing w:after="40" w:before="40" w:lineRule="auto"/>
+              <w:jc w:val="left"/>
+              <w:rPr>
+                <w:rFonts w:ascii="Arial" w:cs="Arial" w:eastAsia="Arial" w:hAnsi="Arial"/>
+                <w:b w:val="1"/>
+                <w:bCs w:val="1"/>
+                <w:sz w:val="22"/>
+                <w:szCs w:val="22"/>
+              </w:rPr>
+            </w:pPr>
+            <w:r>
+              <w:rPr>
+                <w:rFonts w:ascii="Arial" w:cs="Arial" w:eastAsia="Arial" w:hAnsi="Arial"/>
+                <w:b w:val="1"/>
+                <w:bCs w:val="1"/>
+                <w:sz w:val="22"/>
+                <w:szCs w:val="22"/>
+                <w:rtl w:val="0"/>
+              </w:rPr>
+              <w:t xml:space="preserve">RESPUESTAS</w:t>
+            </w:r>
+          </w:p>
+        </w:tc>
+        <w:tc>
+          <w:tcPr>
+            <w:tcW w:w="2340" w:type="dxa"/>
+            <w:shd w:fill="D9D9D9" w:val="clear"/>
+            <w:vAlign w:val="center"/>
+          </w:tcPr>
+          <w:p>
+            <w:pPr>
+              <w:spacing w:after="40" w:before="40" w:lineRule="auto"/>
+              <w:jc w:val="center"/>
+              <w:rPr>
+                <w:rFonts w:ascii="Arial" w:cs="Arial" w:eastAsia="Arial" w:hAnsi="Arial"/>
+                <w:b w:val="1"/>
+                <w:bCs w:val="1"/>
+                <w:sz w:val="22"/>
+                <w:szCs w:val="22"/>
+              </w:rPr>
+            </w:pPr>
+            <w:r>
+              <w:rPr>
+                <w:rFonts w:ascii="Arial" w:cs="Arial" w:eastAsia="Arial" w:hAnsi="Arial"/>
+                <w:b w:val="1"/>
+                <w:bCs w:val="1"/>
+                <w:sz w:val="22"/>
+                <w:szCs w:val="22"/>
+                <w:rtl w:val="0"/>
+              </w:rPr>
+              <w:t xml:space="preserve">FRECUENCIAS</w:t>
+            </w:r>
+          </w:p>
+        </w:tc>
+        <w:tc>
+          <w:tcPr>
+            <w:tcW w:w="2340" w:type="dxa"/>
+            <w:shd w:fill="D9D9D9" w:val="clear"/>
+            <w:vAlign w:val="center"/>
+          </w:tcPr>
+          <w:p>
+            <w:pPr>
+              <w:spacing w:after="40" w:before="40" w:lineRule="auto"/>
+              <w:jc w:val="center"/>
+              <w:rPr>
+                <w:rFonts w:ascii="Arial" w:cs="Arial" w:eastAsia="Arial" w:hAnsi="Arial"/>
+                <w:b w:val="1"/>
+                <w:bCs w:val="1"/>
+                <w:sz w:val="22"/>
+                <w:szCs w:val="22"/>
+              </w:rPr>
+            </w:pPr>
+            <w:r>
+              <w:rPr>
+                <w:rFonts w:ascii="Arial" w:cs="Arial" w:eastAsia="Arial" w:hAnsi="Arial"/>
+                <w:b w:val="1"/>
+                <w:bCs w:val="1"/>
+                <w:sz w:val="22"/>
+                <w:szCs w:val="22"/>
+                <w:rtl w:val="0"/>
+              </w:rPr>
+              <w:t xml:space="preserve">%</w:t>
+            </w:r>
+          </w:p>
+        </w:tc>
+      </w:tr>
+      <w:tr>
+        <w:tc>
+          <w:tcPr>
+            <w:tcW w:w="4680" w:type="dxa"/>
+            <w:vAlign w:val="center"/>
+          </w:tcPr>
+          <w:p>
+            <w:pPr>
+              <w:spacing w:after="40" w:before="40" w:lineRule="auto"/>
+              <w:jc w:val="left"/>
+              <w:rPr>
+                <w:rFonts w:ascii="Arial" w:cs="Arial" w:eastAsia="Arial" w:hAnsi="Arial"/>
+                <w:sz w:val="22"/>
+                <w:szCs w:val="22"/>
+              </w:rPr>
+            </w:pPr>
+            <w:r>
+              <w:rPr>
+                <w:rFonts w:ascii="Arial" w:cs="Arial" w:eastAsia="Arial" w:hAnsi="Arial"/>
+                <w:sz w:val="22"/>
+                <w:szCs w:val="22"/>
+                <w:rtl w:val="0"/>
+              </w:rPr>
+              <w:t xml:space="preserve">Si</w:t>
+            </w:r>
+          </w:p>
+        </w:tc>
+        <w:tc>
+          <w:tcPr>
+            <w:tcW w:w="2340" w:type="dxa"/>
+            <w:vAlign w:val="center"/>
+          </w:tcPr>
+          <w:p>
+            <w:pPr>
+              <w:spacing w:after="40" w:before="40" w:lineRule="auto"/>
+              <w:jc w:val="center"/>
+              <w:rPr>
+                <w:rFonts w:ascii="Arial" w:cs="Arial" w:eastAsia="Arial" w:hAnsi="Arial"/>
+                <w:sz w:val="22"/>
+                <w:szCs w:val="22"/>
+              </w:rPr>
+            </w:pPr>
+            <w:r>
+              <w:rPr>
+                <w:rFonts w:ascii="Arial" w:cs="Arial" w:eastAsia="Arial" w:hAnsi="Arial"/>
+                <w:sz w:val="22"/>
+                <w:szCs w:val="22"/>
+                <w:rtl w:val="0"/>
+              </w:rPr>
+              <w:t xml:space="preserve">22</w:t>
+            </w:r>
+          </w:p>
+        </w:tc>
+        <w:tc>
+          <w:tcPr>
+            <w:tcW w:w="2340" w:type="dxa"/>
+            <w:vAlign w:val="center"/>
+          </w:tcPr>
+          <w:p>
+            <w:pPr>
+              <w:spacing w:after="40" w:before="40" w:lineRule="auto"/>
+              <w:jc w:val="center"/>
+              <w:rPr>
+                <w:rFonts w:ascii="Arial" w:cs="Arial" w:eastAsia="Arial" w:hAnsi="Arial"/>
+                <w:sz w:val="22"/>
+                <w:szCs w:val="22"/>
+              </w:rPr>
+            </w:pPr>
+            <w:r>
+              <w:rPr>
+                <w:rFonts w:ascii="Arial" w:cs="Arial" w:eastAsia="Arial" w:hAnsi="Arial"/>
+                <w:sz w:val="22"/>
+                <w:szCs w:val="22"/>
+                <w:rtl w:val="0"/>
+              </w:rPr>
+              <w:t xml:space="preserve">73 %</w:t>
+            </w:r>
+          </w:p>
+        </w:tc>
+      </w:tr>
+      <w:tr>
+        <w:tc>
+          <w:tcPr>
+            <w:tcW w:w="4680" w:type="dxa"/>
+            <w:vAlign w:val="center"/>
+          </w:tcPr>
+          <w:p>
+            <w:pPr>
+              <w:spacing w:after="40" w:before="40" w:lineRule="auto"/>
+              <w:jc w:val="left"/>
+              <w:rPr>
+                <w:rFonts w:ascii="Arial" w:cs="Arial" w:eastAsia="Arial" w:hAnsi="Arial"/>
+                <w:sz w:val="22"/>
+                <w:szCs w:val="22"/>
+              </w:rPr>
+            </w:pPr>
+            <w:r>
+              <w:rPr>
+                <w:rFonts w:ascii="Arial" w:cs="Arial" w:eastAsia="Arial" w:hAnsi="Arial"/>
+                <w:sz w:val="22"/>
+                <w:szCs w:val="22"/>
+                <w:rtl w:val="0"/>
+              </w:rPr>
+              <w:t xml:space="preserve">Ya las conozco</w:t>
+            </w:r>
+          </w:p>
+        </w:tc>
+        <w:tc>
+          <w:tcPr>
+            <w:tcW w:w="2340" w:type="dxa"/>
+            <w:vAlign w:val="center"/>
+          </w:tcPr>
+          <w:p>
+            <w:pPr>
+              <w:spacing w:after="40" w:before="40" w:lineRule="auto"/>
+              <w:jc w:val="center"/>
+              <w:rPr>
+                <w:rFonts w:ascii="Arial" w:cs="Arial" w:eastAsia="Arial" w:hAnsi="Arial"/>
+                <w:sz w:val="22"/>
+                <w:szCs w:val="22"/>
+              </w:rPr>
+            </w:pPr>
+            <w:r>
+              <w:rPr>
+                <w:rFonts w:ascii="Arial" w:cs="Arial" w:eastAsia="Arial" w:hAnsi="Arial"/>
+                <w:sz w:val="22"/>
+                <w:szCs w:val="22"/>
+                <w:rtl w:val="0"/>
+              </w:rPr>
+              <w:t xml:space="preserve">5</w:t>
+            </w:r>
+          </w:p>
+        </w:tc>
+        <w:tc>
+          <w:tcPr>
+            <w:tcW w:w="2340" w:type="dxa"/>
+            <w:vAlign w:val="center"/>
+          </w:tcPr>
+          <w:p>
+            <w:pPr>
+              <w:spacing w:after="40" w:before="40" w:lineRule="auto"/>
+              <w:jc w:val="center"/>
+              <w:rPr>
+                <w:rFonts w:ascii="Arial" w:cs="Arial" w:eastAsia="Arial" w:hAnsi="Arial"/>
+                <w:sz w:val="22"/>
+                <w:szCs w:val="22"/>
+              </w:rPr>
+            </w:pPr>
+            <w:r>
+              <w:rPr>
+                <w:rFonts w:ascii="Arial" w:cs="Arial" w:eastAsia="Arial" w:hAnsi="Arial"/>
+                <w:sz w:val="22"/>
+                <w:szCs w:val="22"/>
+                <w:rtl w:val="0"/>
+              </w:rPr>
+              <w:t xml:space="preserve">17 %</w:t>
+            </w:r>
+          </w:p>
+        </w:tc>
+      </w:tr>
+      <w:tr>
+        <w:tc>
+          <w:tcPr>
+            <w:tcW w:w="4680" w:type="dxa"/>
+            <w:vAlign w:val="center"/>
+          </w:tcPr>
+          <w:p>
+            <w:pPr>
+              <w:spacing w:after="40" w:before="40" w:lineRule="auto"/>
+              <w:jc w:val="left"/>
+              <w:rPr>
+                <w:rFonts w:ascii="Arial" w:cs="Arial" w:eastAsia="Arial" w:hAnsi="Arial"/>
+                <w:sz w:val="22"/>
+                <w:szCs w:val="22"/>
+              </w:rPr>
+            </w:pPr>
+            <w:r>
+              <w:rPr>
+                <w:rFonts w:ascii="Arial" w:cs="Arial" w:eastAsia="Arial" w:hAnsi="Arial"/>
+                <w:sz w:val="22"/>
+                <w:szCs w:val="22"/>
+                <w:rtl w:val="0"/>
+              </w:rPr>
+              <w:t xml:space="preserve">No</w:t>
+            </w:r>
+          </w:p>
+        </w:tc>
+        <w:tc>
+          <w:tcPr>
+            <w:tcW w:w="2340" w:type="dxa"/>
+            <w:vAlign w:val="center"/>
+          </w:tcPr>
+          <w:p>
+            <w:pPr>
+              <w:spacing w:after="40" w:before="40" w:lineRule="auto"/>
+              <w:jc w:val="center"/>
+              <w:rPr>
+                <w:rFonts w:ascii="Arial" w:cs="Arial" w:eastAsia="Arial" w:hAnsi="Arial"/>
+                <w:sz w:val="22"/>
+                <w:szCs w:val="22"/>
+              </w:rPr>
+            </w:pPr>
+            <w:r>
+              <w:rPr>
+                <w:rFonts w:ascii="Arial" w:cs="Arial" w:eastAsia="Arial" w:hAnsi="Arial"/>
+                <w:sz w:val="22"/>
+                <w:szCs w:val="22"/>
+                <w:rtl w:val="0"/>
+              </w:rPr>
+              <w:t xml:space="preserve">3</w:t>
+            </w:r>
+          </w:p>
+        </w:tc>
+        <w:tc>
+          <w:tcPr>
+            <w:tcW w:w="2340" w:type="dxa"/>
+            <w:vAlign w:val="center"/>
+          </w:tcPr>
+          <w:p>
+            <w:pPr>
+              <w:spacing w:after="40" w:before="40" w:lineRule="auto"/>
+              <w:jc w:val="center"/>
+              <w:rPr>
+                <w:rFonts w:ascii="Arial" w:cs="Arial" w:eastAsia="Arial" w:hAnsi="Arial"/>
+                <w:sz w:val="22"/>
+                <w:szCs w:val="22"/>
+              </w:rPr>
+            </w:pPr>
+            <w:r>
+              <w:rPr>
+                <w:rFonts w:ascii="Arial" w:cs="Arial" w:eastAsia="Arial" w:hAnsi="Arial"/>
+                <w:sz w:val="22"/>
+                <w:szCs w:val="22"/>
+                <w:rtl w:val="0"/>
+              </w:rPr>
+              <w:t xml:space="preserve">10 %</w:t>
+            </w:r>
+          </w:p>
+        </w:tc>
+      </w:tr>
+      <w:tr>
+        <w:tc>
+          <w:tcPr>
+            <w:tcW w:w="4680" w:type="dxa"/>
+            <w:shd w:fill="F2F2F2" w:val="clear"/>
+            <w:vAlign w:val="center"/>
+          </w:tcPr>
+          <w:p>
+            <w:pPr>
+              <w:spacing w:after="40" w:before="40" w:lineRule="auto"/>
+              <w:jc w:val="left"/>
+              <w:rPr>
+                <w:rFonts w:ascii="Arial" w:cs="Arial" w:eastAsia="Arial" w:hAnsi="Arial"/>
+                <w:b w:val="1"/>
+                <w:bCs w:val="1"/>
+                <w:sz w:val="22"/>
+                <w:szCs w:val="22"/>
+              </w:rPr>
+            </w:pPr>
+            <w:r>
+              <w:rPr>
+                <w:rFonts w:ascii="Arial" w:cs="Arial" w:eastAsia="Arial" w:hAnsi="Arial"/>
+                <w:b w:val="1"/>
+                <w:bCs w:val="1"/>
+                <w:sz w:val="22"/>
+                <w:szCs w:val="22"/>
+                <w:rtl w:val="0"/>
+              </w:rPr>
+              <w:t xml:space="preserve">TOTAL</w:t>
+            </w:r>
+          </w:p>
+        </w:tc>
+        <w:tc>
+          <w:tcPr>
+            <w:tcW w:w="2340" w:type="dxa"/>
+            <w:shd w:fill="F2F2F2" w:val="clear"/>
+            <w:vAlign w:val="center"/>
+          </w:tcPr>
+          <w:p>
+            <w:pPr>
+              <w:spacing w:after="40" w:before="40" w:lineRule="auto"/>
+              <w:jc w:val="center"/>
+              <w:rPr>
+                <w:rFonts w:ascii="Arial" w:cs="Arial" w:eastAsia="Arial" w:hAnsi="Arial"/>
+                <w:b w:val="1"/>
+                <w:bCs w:val="1"/>
+                <w:sz w:val="22"/>
+                <w:szCs w:val="22"/>
+              </w:rPr>
+            </w:pPr>
+            <w:r>
+              <w:rPr>
+                <w:rFonts w:ascii="Arial" w:cs="Arial" w:eastAsia="Arial" w:hAnsi="Arial"/>
+                <w:b w:val="1"/>
+                <w:bCs w:val="1"/>
+                <w:sz w:val="22"/>
+                <w:szCs w:val="22"/>
+                <w:rtl w:val="0"/>
+              </w:rPr>
+              <w:t xml:space="preserve">30</w:t>
+            </w:r>
+          </w:p>
+        </w:tc>
+        <w:tc>
+          <w:tcPr>
+            <w:tcW w:w="2340" w:type="dxa"/>
+            <w:shd w:fill="F2F2F2" w:val="clear"/>
+            <w:vAlign w:val="center"/>
+          </w:tcPr>
+          <w:p>
+            <w:pPr>
+              <w:spacing w:after="40" w:before="40" w:lineRule="auto"/>
+              <w:jc w:val="center"/>
+              <w:rPr>
+                <w:rFonts w:ascii="Arial" w:cs="Arial" w:eastAsia="Arial" w:hAnsi="Arial"/>
+                <w:b w:val="1"/>
+                <w:bCs w:val="1"/>
+                <w:sz w:val="22"/>
+                <w:szCs w:val="22"/>
+              </w:rPr>
+            </w:pPr>
+            <w:r>
+              <w:rPr>
+                <w:rFonts w:ascii="Arial" w:cs="Arial" w:eastAsia="Arial" w:hAnsi="Arial"/>
+                <w:b w:val="1"/>
+                <w:bCs w:val="1"/>
+                <w:sz w:val="22"/>
+                <w:szCs w:val="22"/>
+                <w:rtl w:val="0"/>
+              </w:rPr>
+              <w:t xml:space="preserve">100 %</w:t>
+            </w:r>
+          </w:p>
+        </w:tc>
+      </w:tr>
+    </w:tbl>
+    <w:p>
+      <w:pPr>
+        <w:spacing w:after="0" w:before="0" w:lineRule="auto"/>
+        <w:rPr>
+          <w:rFonts w:ascii="Arial" w:cs="Arial" w:eastAsia="Arial" w:hAnsi="Arial"/>
+          <w:sz w:val="24"/>
+          <w:szCs w:val="24"/>
+        </w:rPr>
+      </w:pPr>
+    </w:p>
+    <w:p>
+      <w:pPr>
+        <w:spacing w:after="240" w:before="240" w:lineRule="auto"/>
+        <w:rPr>
+          <w:rFonts w:ascii="Arial" w:cs="Arial" w:eastAsia="Arial" w:hAnsi="Arial"/>
+          <w:b w:val="1"/>
+          <w:bCs w:val="1"/>
+          <w:sz w:val="22"/>
+          <w:szCs w:val="22"/>
+        </w:rPr>
+      </w:pPr>
+      <w:r>
+        <w:rPr>
+          <w:rFonts w:ascii="Arial" w:cs="Arial" w:eastAsia="Arial" w:hAnsi="Arial"/>
+          <w:b w:val="1"/>
+          <w:bCs w:val="1"/>
+          <w:sz w:val="22"/>
+          <w:szCs w:val="22"/>
+          <w:rtl w:val="0"/>
+        </w:rPr>
+        <w:t xml:space="preserve">Tabla 5. ¿Estarías dispuesto a recibir instrucciones antes de consumir el Mochi sumergido en nitrógeno liquido si el vendedor te indica?</w:t>
+      </w:r>
+    </w:p>
+    <w:tbl>
+      <w:tblPr>
+        <w:tblStyle w:val="Tablanormal"/>
+        <w:tblW w:w="9360" w:type="dxa"/>
+        <w:jc w:val="left"/>
+        <w:tblBorders>
+          <w:top w:color="000000" w:space="0" w:sz="4" w:val="single"/>
+          <w:left w:color="000000" w:space="0" w:sz="4" w:val="single"/>
+          <w:bottom w:color="000000" w:space="0" w:sz="4" w:val="single"/>
+          <w:right w:color="000000" w:space="0" w:sz="4" w:val="single"/>
+          <w:insideH w:color="000000" w:space="0" w:sz="4" w:val="single"/>
+          <w:insideV w:color="000000" w:space="0" w:sz="4" w:val="single"/>
+        </w:tblBorders>
+        <w:tblLayout w:type="fixed"/>
+        <w:tblCellMar>
+          <w:top w:w="60" w:type="dxa"/>
+          <w:left w:w="108" w:type="dxa"/>
+          <w:bottom w:w="60" w:type="dxa"/>
+          <w:right w:w="108" w:type="dxa"/>
+        </w:tblCellMar>
+      </w:tblPr>
+      <w:tblGrid>
+        <w:gridCol w:w="4680"/>
+        <w:gridCol w:w="2340"/>
+        <w:gridCol w:w="2340"/>
+      </w:tblGrid>
+      <w:tr>
+        <w:trPr>
+          <w:tblHeader/>
+        </w:trPr>
+        <w:tc>
+          <w:tcPr>
+            <w:tcW w:w="4680" w:type="dxa"/>
+            <w:shd w:fill="D9D9D9" w:val="clear"/>
+            <w:vAlign w:val="center"/>
+          </w:tcPr>
+          <w:p>
+            <w:pPr>
+              <w:spacing w:after="40" w:before="40" w:lineRule="auto"/>
+              <w:jc w:val="left"/>
+              <w:rPr>
+                <w:rFonts w:ascii="Arial" w:cs="Arial" w:eastAsia="Arial" w:hAnsi="Arial"/>
+                <w:b w:val="1"/>
+                <w:bCs w:val="1"/>
+                <w:sz w:val="22"/>
+                <w:szCs w:val="22"/>
+              </w:rPr>
+            </w:pPr>
+            <w:r>
+              <w:rPr>
+                <w:rFonts w:ascii="Arial" w:cs="Arial" w:eastAsia="Arial" w:hAnsi="Arial"/>
+                <w:b w:val="1"/>
+                <w:bCs w:val="1"/>
+                <w:sz w:val="22"/>
+                <w:szCs w:val="22"/>
+                <w:rtl w:val="0"/>
+              </w:rPr>
+              <w:t xml:space="preserve">RESPUESTAS</w:t>
+            </w:r>
+          </w:p>
+        </w:tc>
+        <w:tc>
+          <w:tcPr>
+            <w:tcW w:w="2340" w:type="dxa"/>
+            <w:shd w:fill="D9D9D9" w:val="clear"/>
+            <w:vAlign w:val="center"/>
+          </w:tcPr>
+          <w:p>
+            <w:pPr>
+              <w:spacing w:after="40" w:before="40" w:lineRule="auto"/>
+              <w:jc w:val="center"/>
+              <w:rPr>
+                <w:rFonts w:ascii="Arial" w:cs="Arial" w:eastAsia="Arial" w:hAnsi="Arial"/>
+                <w:b w:val="1"/>
+                <w:bCs w:val="1"/>
+                <w:sz w:val="22"/>
+                <w:szCs w:val="22"/>
+              </w:rPr>
+            </w:pPr>
+            <w:r>
+              <w:rPr>
+                <w:rFonts w:ascii="Arial" w:cs="Arial" w:eastAsia="Arial" w:hAnsi="Arial"/>
+                <w:b w:val="1"/>
+                <w:bCs w:val="1"/>
+                <w:sz w:val="22"/>
+                <w:szCs w:val="22"/>
+                <w:rtl w:val="0"/>
+              </w:rPr>
+              <w:t xml:space="preserve">FRECUENCIAS</w:t>
+            </w:r>
+          </w:p>
+        </w:tc>
+        <w:tc>
+          <w:tcPr>
+            <w:tcW w:w="2340" w:type="dxa"/>
+            <w:shd w:fill="D9D9D9" w:val="clear"/>
+            <w:vAlign w:val="center"/>
+          </w:tcPr>
+          <w:p>
+            <w:pPr>
+              <w:spacing w:after="40" w:before="40" w:lineRule="auto"/>
+              <w:jc w:val="center"/>
+              <w:rPr>
+                <w:rFonts w:ascii="Arial" w:cs="Arial" w:eastAsia="Arial" w:hAnsi="Arial"/>
+                <w:b w:val="1"/>
+                <w:bCs w:val="1"/>
+                <w:sz w:val="22"/>
+                <w:szCs w:val="22"/>
+              </w:rPr>
+            </w:pPr>
+            <w:r>
+              <w:rPr>
+                <w:rFonts w:ascii="Arial" w:cs="Arial" w:eastAsia="Arial" w:hAnsi="Arial"/>
+                <w:b w:val="1"/>
+                <w:bCs w:val="1"/>
+                <w:sz w:val="22"/>
+                <w:szCs w:val="22"/>
+                <w:rtl w:val="0"/>
+              </w:rPr>
+              <w:t xml:space="preserve">%</w:t>
+            </w:r>
+          </w:p>
+        </w:tc>
+      </w:tr>
+      <w:tr>
+        <w:tc>
+          <w:tcPr>
+            <w:tcW w:w="4680" w:type="dxa"/>
+            <w:vAlign w:val="center"/>
+          </w:tcPr>
+          <w:p>
+            <w:pPr>
+              <w:spacing w:after="40" w:before="40" w:lineRule="auto"/>
+              <w:jc w:val="left"/>
+              <w:rPr>
+                <w:rFonts w:ascii="Arial" w:cs="Arial" w:eastAsia="Arial" w:hAnsi="Arial"/>
+                <w:sz w:val="22"/>
+                <w:szCs w:val="22"/>
+              </w:rPr>
+            </w:pPr>
+            <w:r>
+              <w:rPr>
+                <w:rFonts w:ascii="Arial" w:cs="Arial" w:eastAsia="Arial" w:hAnsi="Arial"/>
+                <w:sz w:val="22"/>
+                <w:szCs w:val="22"/>
+                <w:rtl w:val="0"/>
+              </w:rPr>
+              <w:t xml:space="preserve">Si</w:t>
+            </w:r>
+          </w:p>
+        </w:tc>
+        <w:tc>
+          <w:tcPr>
+            <w:tcW w:w="2340" w:type="dxa"/>
+            <w:vAlign w:val="center"/>
+          </w:tcPr>
+          <w:p>
+            <w:pPr>
+              <w:spacing w:after="40" w:before="40" w:lineRule="auto"/>
+              <w:jc w:val="center"/>
+              <w:rPr>
+                <w:rFonts w:ascii="Arial" w:cs="Arial" w:eastAsia="Arial" w:hAnsi="Arial"/>
+                <w:sz w:val="22"/>
+                <w:szCs w:val="22"/>
+              </w:rPr>
+            </w:pPr>
+            <w:r>
+              <w:rPr>
+                <w:rFonts w:ascii="Arial" w:cs="Arial" w:eastAsia="Arial" w:hAnsi="Arial"/>
+                <w:sz w:val="22"/>
+                <w:szCs w:val="22"/>
+                <w:rtl w:val="0"/>
+              </w:rPr>
+              <w:t xml:space="preserve">23</w:t>
+            </w:r>
+          </w:p>
+        </w:tc>
+        <w:tc>
+          <w:tcPr>
+            <w:tcW w:w="2340" w:type="dxa"/>
+            <w:vAlign w:val="center"/>
+          </w:tcPr>
+          <w:p>
+            <w:pPr>
+              <w:spacing w:after="40" w:before="40" w:lineRule="auto"/>
+              <w:jc w:val="center"/>
+              <w:rPr>
+                <w:rFonts w:ascii="Arial" w:cs="Arial" w:eastAsia="Arial" w:hAnsi="Arial"/>
+                <w:sz w:val="22"/>
+                <w:szCs w:val="22"/>
+              </w:rPr>
+            </w:pPr>
+            <w:r>
+              <w:rPr>
+                <w:rFonts w:ascii="Arial" w:cs="Arial" w:eastAsia="Arial" w:hAnsi="Arial"/>
+                <w:sz w:val="22"/>
+                <w:szCs w:val="22"/>
+                <w:rtl w:val="0"/>
+              </w:rPr>
+              <w:t xml:space="preserve">77 %</w:t>
+            </w:r>
+          </w:p>
+        </w:tc>
+      </w:tr>
+      <w:tr>
+        <w:tc>
+          <w:tcPr>
+            <w:tcW w:w="4680" w:type="dxa"/>
+            <w:vAlign w:val="center"/>
+          </w:tcPr>
+          <w:p>
+            <w:pPr>
+              <w:spacing w:after="40" w:before="40" w:lineRule="auto"/>
+              <w:jc w:val="left"/>
+              <w:rPr>
+                <w:rFonts w:ascii="Arial" w:cs="Arial" w:eastAsia="Arial" w:hAnsi="Arial"/>
+                <w:sz w:val="22"/>
+                <w:szCs w:val="22"/>
+              </w:rPr>
+            </w:pPr>
+            <w:r>
+              <w:rPr>
+                <w:rFonts w:ascii="Arial" w:cs="Arial" w:eastAsia="Arial" w:hAnsi="Arial"/>
+                <w:sz w:val="22"/>
+                <w:szCs w:val="22"/>
+                <w:rtl w:val="0"/>
+              </w:rPr>
+              <w:t xml:space="preserve">Tal vez</w:t>
+            </w:r>
+          </w:p>
+        </w:tc>
+        <w:tc>
+          <w:tcPr>
+            <w:tcW w:w="2340" w:type="dxa"/>
+            <w:vAlign w:val="center"/>
+          </w:tcPr>
+          <w:p>
+            <w:pPr>
+              <w:spacing w:after="40" w:before="40" w:lineRule="auto"/>
+              <w:jc w:val="center"/>
+              <w:rPr>
+                <w:rFonts w:ascii="Arial" w:cs="Arial" w:eastAsia="Arial" w:hAnsi="Arial"/>
+                <w:sz w:val="22"/>
+                <w:szCs w:val="22"/>
+              </w:rPr>
+            </w:pPr>
+            <w:r>
+              <w:rPr>
+                <w:rFonts w:ascii="Arial" w:cs="Arial" w:eastAsia="Arial" w:hAnsi="Arial"/>
+                <w:sz w:val="22"/>
+                <w:szCs w:val="22"/>
+                <w:rtl w:val="0"/>
+              </w:rPr>
+              <w:t xml:space="preserve">5</w:t>
+            </w:r>
+          </w:p>
+        </w:tc>
+        <w:tc>
+          <w:tcPr>
+            <w:tcW w:w="2340" w:type="dxa"/>
+            <w:vAlign w:val="center"/>
+          </w:tcPr>
+          <w:p>
+            <w:pPr>
+              <w:spacing w:after="40" w:before="40" w:lineRule="auto"/>
+              <w:jc w:val="center"/>
+              <w:rPr>
+                <w:rFonts w:ascii="Arial" w:cs="Arial" w:eastAsia="Arial" w:hAnsi="Arial"/>
+                <w:sz w:val="22"/>
+                <w:szCs w:val="22"/>
+              </w:rPr>
+            </w:pPr>
+            <w:r>
+              <w:rPr>
+                <w:rFonts w:ascii="Arial" w:cs="Arial" w:eastAsia="Arial" w:hAnsi="Arial"/>
+                <w:sz w:val="22"/>
+                <w:szCs w:val="22"/>
+                <w:rtl w:val="0"/>
+              </w:rPr>
+              <w:t xml:space="preserve">17 %</w:t>
+            </w:r>
+          </w:p>
+        </w:tc>
+      </w:tr>
+      <w:tr>
+        <w:tc>
+          <w:tcPr>
+            <w:tcW w:w="4680" w:type="dxa"/>
+            <w:vAlign w:val="center"/>
+          </w:tcPr>
+          <w:p>
+            <w:pPr>
+              <w:spacing w:after="40" w:before="40" w:lineRule="auto"/>
+              <w:jc w:val="left"/>
+              <w:rPr>
+                <w:rFonts w:ascii="Arial" w:cs="Arial" w:eastAsia="Arial" w:hAnsi="Arial"/>
+                <w:sz w:val="22"/>
+                <w:szCs w:val="22"/>
+              </w:rPr>
+            </w:pPr>
+            <w:r>
+              <w:rPr>
+                <w:rFonts w:ascii="Arial" w:cs="Arial" w:eastAsia="Arial" w:hAnsi="Arial"/>
+                <w:sz w:val="22"/>
+                <w:szCs w:val="22"/>
+                <w:rtl w:val="0"/>
+              </w:rPr>
+              <w:t xml:space="preserve">No</w:t>
+            </w:r>
+          </w:p>
+        </w:tc>
+        <w:tc>
+          <w:tcPr>
+            <w:tcW w:w="2340" w:type="dxa"/>
+            <w:vAlign w:val="center"/>
+          </w:tcPr>
+          <w:p>
+            <w:pPr>
+              <w:spacing w:after="40" w:before="40" w:lineRule="auto"/>
+              <w:jc w:val="center"/>
+              <w:rPr>
+                <w:rFonts w:ascii="Arial" w:cs="Arial" w:eastAsia="Arial" w:hAnsi="Arial"/>
+                <w:sz w:val="22"/>
+                <w:szCs w:val="22"/>
+              </w:rPr>
+            </w:pPr>
+            <w:r>
+              <w:rPr>
+                <w:rFonts w:ascii="Arial" w:cs="Arial" w:eastAsia="Arial" w:hAnsi="Arial"/>
+                <w:sz w:val="22"/>
+                <w:szCs w:val="22"/>
+                <w:rtl w:val="0"/>
+              </w:rPr>
+              <w:t xml:space="preserve">2</w:t>
+            </w:r>
+          </w:p>
+        </w:tc>
+        <w:tc>
+          <w:tcPr>
+            <w:tcW w:w="2340" w:type="dxa"/>
+            <w:vAlign w:val="center"/>
+          </w:tcPr>
+          <w:p>
+            <w:pPr>
+              <w:spacing w:after="40" w:before="40" w:lineRule="auto"/>
+              <w:jc w:val="center"/>
+              <w:rPr>
+                <w:rFonts w:ascii="Arial" w:cs="Arial" w:eastAsia="Arial" w:hAnsi="Arial"/>
+                <w:sz w:val="22"/>
+                <w:szCs w:val="22"/>
+              </w:rPr>
+            </w:pPr>
+            <w:r>
+              <w:rPr>
+                <w:rFonts w:ascii="Arial" w:cs="Arial" w:eastAsia="Arial" w:hAnsi="Arial"/>
+                <w:sz w:val="22"/>
+                <w:szCs w:val="22"/>
+                <w:rtl w:val="0"/>
+              </w:rPr>
+              <w:t xml:space="preserve">7 %</w:t>
+            </w:r>
+          </w:p>
+        </w:tc>
+      </w:tr>
+      <w:tr>
+        <w:tc>
+          <w:tcPr>
+            <w:tcW w:w="4680" w:type="dxa"/>
+            <w:shd w:fill="F2F2F2" w:val="clear"/>
+            <w:vAlign w:val="center"/>
+          </w:tcPr>
+          <w:p>
+            <w:pPr>
+              <w:spacing w:after="40" w:before="40" w:lineRule="auto"/>
+              <w:jc w:val="left"/>
+              <w:rPr>
+                <w:rFonts w:ascii="Arial" w:cs="Arial" w:eastAsia="Arial" w:hAnsi="Arial"/>
+                <w:b w:val="1"/>
+                <w:bCs w:val="1"/>
+                <w:sz w:val="22"/>
+                <w:szCs w:val="22"/>
+              </w:rPr>
+            </w:pPr>
+            <w:r>
+              <w:rPr>
+                <w:rFonts w:ascii="Arial" w:cs="Arial" w:eastAsia="Arial" w:hAnsi="Arial"/>
+                <w:b w:val="1"/>
+                <w:bCs w:val="1"/>
+                <w:sz w:val="22"/>
+                <w:szCs w:val="22"/>
+                <w:rtl w:val="0"/>
+              </w:rPr>
+              <w:t xml:space="preserve">TOTAL</w:t>
+            </w:r>
+          </w:p>
+        </w:tc>
+        <w:tc>
+          <w:tcPr>
+            <w:tcW w:w="2340" w:type="dxa"/>
+            <w:shd w:fill="F2F2F2" w:val="clear"/>
+            <w:vAlign w:val="center"/>
+          </w:tcPr>
+          <w:p>
+            <w:pPr>
+              <w:spacing w:after="40" w:before="40" w:lineRule="auto"/>
+              <w:jc w:val="center"/>
+              <w:rPr>
+                <w:rFonts w:ascii="Arial" w:cs="Arial" w:eastAsia="Arial" w:hAnsi="Arial"/>
+                <w:b w:val="1"/>
+                <w:bCs w:val="1"/>
+                <w:sz w:val="22"/>
+                <w:szCs w:val="22"/>
+              </w:rPr>
+            </w:pPr>
+            <w:r>
+              <w:rPr>
+                <w:rFonts w:ascii="Arial" w:cs="Arial" w:eastAsia="Arial" w:hAnsi="Arial"/>
+                <w:b w:val="1"/>
+                <w:bCs w:val="1"/>
+                <w:sz w:val="22"/>
+                <w:szCs w:val="22"/>
+                <w:rtl w:val="0"/>
+              </w:rPr>
+              <w:t xml:space="preserve">30</w:t>
+            </w:r>
+          </w:p>
+        </w:tc>
+        <w:tc>
+          <w:tcPr>
+            <w:tcW w:w="2340" w:type="dxa"/>
+            <w:shd w:fill="F2F2F2" w:val="clear"/>
+            <w:vAlign w:val="center"/>
+          </w:tcPr>
+          <w:p>
+            <w:pPr>
+              <w:spacing w:after="40" w:before="40" w:lineRule="auto"/>
+              <w:jc w:val="center"/>
+              <w:rPr>
+                <w:rFonts w:ascii="Arial" w:cs="Arial" w:eastAsia="Arial" w:hAnsi="Arial"/>
+                <w:b w:val="1"/>
+                <w:bCs w:val="1"/>
+                <w:sz w:val="22"/>
+                <w:szCs w:val="22"/>
+              </w:rPr>
+            </w:pPr>
+            <w:r>
+              <w:rPr>
+                <w:rFonts w:ascii="Arial" w:cs="Arial" w:eastAsia="Arial" w:hAnsi="Arial"/>
+                <w:b w:val="1"/>
+                <w:bCs w:val="1"/>
+                <w:sz w:val="22"/>
+                <w:szCs w:val="22"/>
+                <w:rtl w:val="0"/>
+              </w:rPr>
+              <w:t xml:space="preserve">101 %</w:t>
+            </w:r>
+          </w:p>
+        </w:tc>
+      </w:tr>
+    </w:tbl>
+    <w:p>
+      <w:pPr>
+        <w:spacing w:after="0" w:before="0" w:lineRule="auto"/>
+        <w:rPr>
+          <w:rFonts w:ascii="Arial" w:cs="Arial" w:eastAsia="Arial" w:hAnsi="Arial"/>
+          <w:sz w:val="24"/>
+          <w:szCs w:val="24"/>
+        </w:rPr>
+      </w:pPr>
+    </w:p>
+    <w:p>
+      <w:pPr>
+        <w:spacing w:after="240" w:before="240" w:lineRule="auto"/>
+        <w:rPr>
+          <w:rFonts w:ascii="Arial" w:cs="Arial" w:eastAsia="Arial" w:hAnsi="Arial"/>
+          <w:b w:val="1"/>
+          <w:bCs w:val="1"/>
+          <w:sz w:val="22"/>
+          <w:szCs w:val="22"/>
+        </w:rPr>
+      </w:pPr>
+      <w:r>
+        <w:rPr>
+          <w:rFonts w:ascii="Arial" w:cs="Arial" w:eastAsia="Arial" w:hAnsi="Arial"/>
+          <w:b w:val="1"/>
+          <w:bCs w:val="1"/>
+          <w:sz w:val="22"/>
+          <w:szCs w:val="22"/>
+          <w:rtl w:val="0"/>
+        </w:rPr>
+        <w:t xml:space="preserve">Tabla 6. ¿Te parece atractivo el efecto del humo saliendo del mochi y expulsando vapor por tu boca?</w:t>
+      </w:r>
+    </w:p>
+    <w:tbl>
+      <w:tblPr>
+        <w:tblStyle w:val="Tablanormal"/>
+        <w:tblW w:w="9360" w:type="dxa"/>
+        <w:jc w:val="left"/>
+        <w:tblBorders>
+          <w:top w:color="000000" w:space="0" w:sz="4" w:val="single"/>
+          <w:left w:color="000000" w:space="0" w:sz="4" w:val="single"/>
+          <w:bottom w:color="000000" w:space="0" w:sz="4" w:val="single"/>
+          <w:right w:color="000000" w:space="0" w:sz="4" w:val="single"/>
+          <w:insideH w:color="000000" w:space="0" w:sz="4" w:val="single"/>
+          <w:insideV w:color="000000" w:space="0" w:sz="4" w:val="single"/>
+        </w:tblBorders>
+        <w:tblLayout w:type="fixed"/>
+        <w:tblCellMar>
+          <w:top w:w="60" w:type="dxa"/>
+          <w:left w:w="108" w:type="dxa"/>
+          <w:bottom w:w="60" w:type="dxa"/>
+          <w:right w:w="108" w:type="dxa"/>
+        </w:tblCellMar>
+      </w:tblPr>
+      <w:tblGrid>
+        <w:gridCol w:w="4680"/>
+        <w:gridCol w:w="2340"/>
+        <w:gridCol w:w="2340"/>
+      </w:tblGrid>
+      <w:tr>
+        <w:trPr>
+          <w:tblHeader/>
+        </w:trPr>
+        <w:tc>
+          <w:tcPr>
+            <w:tcW w:w="4680" w:type="dxa"/>
+            <w:shd w:fill="D9D9D9" w:val="clear"/>
+            <w:vAlign w:val="center"/>
+          </w:tcPr>
+          <w:p>
+            <w:pPr>
+              <w:spacing w:after="40" w:before="40" w:lineRule="auto"/>
+              <w:jc w:val="left"/>
+              <w:rPr>
+                <w:rFonts w:ascii="Arial" w:cs="Arial" w:eastAsia="Arial" w:hAnsi="Arial"/>
+                <w:b w:val="1"/>
+                <w:bCs w:val="1"/>
+                <w:sz w:val="22"/>
+                <w:szCs w:val="22"/>
+              </w:rPr>
+            </w:pPr>
+            <w:r>
+              <w:rPr>
+                <w:rFonts w:ascii="Arial" w:cs="Arial" w:eastAsia="Arial" w:hAnsi="Arial"/>
+                <w:b w:val="1"/>
+                <w:bCs w:val="1"/>
+                <w:sz w:val="22"/>
+                <w:szCs w:val="22"/>
+                <w:rtl w:val="0"/>
+              </w:rPr>
+              <w:t xml:space="preserve">RESPUESTAS</w:t>
+            </w:r>
+          </w:p>
+        </w:tc>
+        <w:tc>
+          <w:tcPr>
+            <w:tcW w:w="2340" w:type="dxa"/>
+            <w:shd w:fill="D9D9D9" w:val="clear"/>
+            <w:vAlign w:val="center"/>
+          </w:tcPr>
+          <w:p>
+            <w:pPr>
+              <w:spacing w:after="40" w:before="40" w:lineRule="auto"/>
+              <w:jc w:val="center"/>
+              <w:rPr>
+                <w:rFonts w:ascii="Arial" w:cs="Arial" w:eastAsia="Arial" w:hAnsi="Arial"/>
+                <w:b w:val="1"/>
+                <w:bCs w:val="1"/>
+                <w:sz w:val="22"/>
+                <w:szCs w:val="22"/>
+              </w:rPr>
+            </w:pPr>
+            <w:r>
+              <w:rPr>
+                <w:rFonts w:ascii="Arial" w:cs="Arial" w:eastAsia="Arial" w:hAnsi="Arial"/>
+                <w:b w:val="1"/>
+                <w:bCs w:val="1"/>
+                <w:sz w:val="22"/>
+                <w:szCs w:val="22"/>
+                <w:rtl w:val="0"/>
+              </w:rPr>
+              <w:t xml:space="preserve">FRECUENCIAS</w:t>
+            </w:r>
+          </w:p>
+        </w:tc>
+        <w:tc>
+          <w:tcPr>
+            <w:tcW w:w="2340" w:type="dxa"/>
+            <w:shd w:fill="D9D9D9" w:val="clear"/>
+            <w:vAlign w:val="center"/>
+          </w:tcPr>
+          <w:p>
+            <w:pPr>
+              <w:spacing w:after="40" w:before="40" w:lineRule="auto"/>
+              <w:jc w:val="center"/>
+              <w:rPr>
+                <w:rFonts w:ascii="Arial" w:cs="Arial" w:eastAsia="Arial" w:hAnsi="Arial"/>
+                <w:b w:val="1"/>
+                <w:bCs w:val="1"/>
+                <w:sz w:val="22"/>
+                <w:szCs w:val="22"/>
+              </w:rPr>
+            </w:pPr>
+            <w:r>
+              <w:rPr>
+                <w:rFonts w:ascii="Arial" w:cs="Arial" w:eastAsia="Arial" w:hAnsi="Arial"/>
+                <w:b w:val="1"/>
+                <w:bCs w:val="1"/>
+                <w:sz w:val="22"/>
+                <w:szCs w:val="22"/>
+                <w:rtl w:val="0"/>
+              </w:rPr>
+              <w:t xml:space="preserve">%</w:t>
+            </w:r>
+          </w:p>
+        </w:tc>
+      </w:tr>
+      <w:tr>
+        <w:tc>
+          <w:tcPr>
+            <w:tcW w:w="4680" w:type="dxa"/>
+            <w:vAlign w:val="center"/>
+          </w:tcPr>
+          <w:p>
+            <w:pPr>
+              <w:spacing w:after="40" w:before="40" w:lineRule="auto"/>
+              <w:jc w:val="left"/>
+              <w:rPr>
+                <w:rFonts w:ascii="Arial" w:cs="Arial" w:eastAsia="Arial" w:hAnsi="Arial"/>
+                <w:sz w:val="22"/>
+                <w:szCs w:val="22"/>
+              </w:rPr>
+            </w:pPr>
+            <w:r>
+              <w:rPr>
+                <w:rFonts w:ascii="Arial" w:cs="Arial" w:eastAsia="Arial" w:hAnsi="Arial"/>
+                <w:sz w:val="22"/>
+                <w:szCs w:val="22"/>
+                <w:rtl w:val="0"/>
+              </w:rPr>
+              <w:t xml:space="preserve">Si</w:t>
+            </w:r>
+          </w:p>
+        </w:tc>
+        <w:tc>
+          <w:tcPr>
+            <w:tcW w:w="2340" w:type="dxa"/>
+            <w:vAlign w:val="center"/>
+          </w:tcPr>
+          <w:p>
+            <w:pPr>
+              <w:spacing w:after="40" w:before="40" w:lineRule="auto"/>
+              <w:jc w:val="center"/>
+              <w:rPr>
+                <w:rFonts w:ascii="Arial" w:cs="Arial" w:eastAsia="Arial" w:hAnsi="Arial"/>
+                <w:sz w:val="22"/>
+                <w:szCs w:val="22"/>
+              </w:rPr>
+            </w:pPr>
+            <w:r>
+              <w:rPr>
+                <w:rFonts w:ascii="Arial" w:cs="Arial" w:eastAsia="Arial" w:hAnsi="Arial"/>
+                <w:sz w:val="22"/>
+                <w:szCs w:val="22"/>
+                <w:rtl w:val="0"/>
+              </w:rPr>
+              <w:t xml:space="preserve">24</w:t>
+            </w:r>
+          </w:p>
+        </w:tc>
+        <w:tc>
+          <w:tcPr>
+            <w:tcW w:w="2340" w:type="dxa"/>
+            <w:vAlign w:val="center"/>
+          </w:tcPr>
+          <w:p>
+            <w:pPr>
+              <w:spacing w:after="40" w:before="40" w:lineRule="auto"/>
+              <w:jc w:val="center"/>
+              <w:rPr>
+                <w:rFonts w:ascii="Arial" w:cs="Arial" w:eastAsia="Arial" w:hAnsi="Arial"/>
+                <w:sz w:val="22"/>
+                <w:szCs w:val="22"/>
+              </w:rPr>
+            </w:pPr>
+            <w:r>
+              <w:rPr>
+                <w:rFonts w:ascii="Arial" w:cs="Arial" w:eastAsia="Arial" w:hAnsi="Arial"/>
+                <w:sz w:val="22"/>
+                <w:szCs w:val="22"/>
+                <w:rtl w:val="0"/>
+              </w:rPr>
+              <w:t xml:space="preserve">80 %</w:t>
+            </w:r>
+          </w:p>
+        </w:tc>
+      </w:tr>
+      <w:tr>
+        <w:tc>
+          <w:tcPr>
+            <w:tcW w:w="4680" w:type="dxa"/>
+            <w:vAlign w:val="center"/>
+          </w:tcPr>
+          <w:p>
+            <w:pPr>
+              <w:spacing w:after="40" w:before="40" w:lineRule="auto"/>
+              <w:jc w:val="left"/>
+              <w:rPr>
+                <w:rFonts w:ascii="Arial" w:cs="Arial" w:eastAsia="Arial" w:hAnsi="Arial"/>
+                <w:sz w:val="22"/>
+                <w:szCs w:val="22"/>
+              </w:rPr>
+            </w:pPr>
+            <w:r>
+              <w:rPr>
+                <w:rFonts w:ascii="Arial" w:cs="Arial" w:eastAsia="Arial" w:hAnsi="Arial"/>
+                <w:sz w:val="22"/>
+                <w:szCs w:val="22"/>
+                <w:rtl w:val="0"/>
+              </w:rPr>
+              <w:t xml:space="preserve">No</w:t>
+            </w:r>
+          </w:p>
+        </w:tc>
+        <w:tc>
+          <w:tcPr>
+            <w:tcW w:w="2340" w:type="dxa"/>
+            <w:vAlign w:val="center"/>
+          </w:tcPr>
+          <w:p>
+            <w:pPr>
+              <w:spacing w:after="40" w:before="40" w:lineRule="auto"/>
+              <w:jc w:val="center"/>
+              <w:rPr>
+                <w:rFonts w:ascii="Arial" w:cs="Arial" w:eastAsia="Arial" w:hAnsi="Arial"/>
+                <w:sz w:val="22"/>
+                <w:szCs w:val="22"/>
+              </w:rPr>
+            </w:pPr>
+            <w:r>
+              <w:rPr>
+                <w:rFonts w:ascii="Arial" w:cs="Arial" w:eastAsia="Arial" w:hAnsi="Arial"/>
+                <w:sz w:val="22"/>
+                <w:szCs w:val="22"/>
+                <w:rtl w:val="0"/>
+              </w:rPr>
+              <w:t xml:space="preserve">6</w:t>
+            </w:r>
+          </w:p>
+        </w:tc>
+        <w:tc>
+          <w:tcPr>
+            <w:tcW w:w="2340" w:type="dxa"/>
+            <w:vAlign w:val="center"/>
+          </w:tcPr>
+          <w:p>
+            <w:pPr>
+              <w:spacing w:after="40" w:before="40" w:lineRule="auto"/>
+              <w:jc w:val="center"/>
+              <w:rPr>
+                <w:rFonts w:ascii="Arial" w:cs="Arial" w:eastAsia="Arial" w:hAnsi="Arial"/>
+                <w:sz w:val="22"/>
+                <w:szCs w:val="22"/>
+              </w:rPr>
+            </w:pPr>
+            <w:r>
+              <w:rPr>
+                <w:rFonts w:ascii="Arial" w:cs="Arial" w:eastAsia="Arial" w:hAnsi="Arial"/>
+                <w:sz w:val="22"/>
+                <w:szCs w:val="22"/>
+                <w:rtl w:val="0"/>
+              </w:rPr>
+              <w:t xml:space="preserve">20 %</w:t>
+            </w:r>
+          </w:p>
+        </w:tc>
+      </w:tr>
+      <w:tr>
+        <w:tc>
+          <w:tcPr>
+            <w:tcW w:w="4680" w:type="dxa"/>
+            <w:shd w:fill="F2F2F2" w:val="clear"/>
+            <w:vAlign w:val="center"/>
+          </w:tcPr>
+          <w:p>
+            <w:pPr>
+              <w:spacing w:after="40" w:before="40" w:lineRule="auto"/>
+              <w:jc w:val="left"/>
+              <w:rPr>
+                <w:rFonts w:ascii="Arial" w:cs="Arial" w:eastAsia="Arial" w:hAnsi="Arial"/>
+                <w:b w:val="1"/>
+                <w:bCs w:val="1"/>
+                <w:sz w:val="22"/>
+                <w:szCs w:val="22"/>
+              </w:rPr>
+            </w:pPr>
+            <w:r>
+              <w:rPr>
+                <w:rFonts w:ascii="Arial" w:cs="Arial" w:eastAsia="Arial" w:hAnsi="Arial"/>
+                <w:b w:val="1"/>
+                <w:bCs w:val="1"/>
+                <w:sz w:val="22"/>
+                <w:szCs w:val="22"/>
+                <w:rtl w:val="0"/>
+              </w:rPr>
+              <w:t xml:space="preserve">TOTAL</w:t>
+            </w:r>
+          </w:p>
+        </w:tc>
+        <w:tc>
+          <w:tcPr>
+            <w:tcW w:w="2340" w:type="dxa"/>
+            <w:shd w:fill="F2F2F2" w:val="clear"/>
+            <w:vAlign w:val="center"/>
+          </w:tcPr>
+          <w:p>
+            <w:pPr>
+              <w:spacing w:after="40" w:before="40" w:lineRule="auto"/>
+              <w:jc w:val="center"/>
+              <w:rPr>
+                <w:rFonts w:ascii="Arial" w:cs="Arial" w:eastAsia="Arial" w:hAnsi="Arial"/>
+                <w:b w:val="1"/>
+                <w:bCs w:val="1"/>
+                <w:sz w:val="22"/>
+                <w:szCs w:val="22"/>
+              </w:rPr>
+            </w:pPr>
+            <w:r>
+              <w:rPr>
+                <w:rFonts w:ascii="Arial" w:cs="Arial" w:eastAsia="Arial" w:hAnsi="Arial"/>
+                <w:b w:val="1"/>
+                <w:bCs w:val="1"/>
+                <w:sz w:val="22"/>
+                <w:szCs w:val="22"/>
+                <w:rtl w:val="0"/>
+              </w:rPr>
+              <w:t xml:space="preserve">30</w:t>
+            </w:r>
+          </w:p>
+        </w:tc>
+        <w:tc>
+          <w:tcPr>
+            <w:tcW w:w="2340" w:type="dxa"/>
+            <w:shd w:fill="F2F2F2" w:val="clear"/>
+            <w:vAlign w:val="center"/>
+          </w:tcPr>
+          <w:p>
+            <w:pPr>
+              <w:spacing w:after="40" w:before="40" w:lineRule="auto"/>
+              <w:jc w:val="center"/>
+              <w:rPr>
+                <w:rFonts w:ascii="Arial" w:cs="Arial" w:eastAsia="Arial" w:hAnsi="Arial"/>
+                <w:b w:val="1"/>
+                <w:bCs w:val="1"/>
+                <w:sz w:val="22"/>
+                <w:szCs w:val="22"/>
+              </w:rPr>
+            </w:pPr>
+            <w:r>
+              <w:rPr>
+                <w:rFonts w:ascii="Arial" w:cs="Arial" w:eastAsia="Arial" w:hAnsi="Arial"/>
+                <w:b w:val="1"/>
+                <w:bCs w:val="1"/>
+                <w:sz w:val="22"/>
+                <w:szCs w:val="22"/>
+                <w:rtl w:val="0"/>
+              </w:rPr>
+              <w:t xml:space="preserve">100 %</w:t>
+            </w:r>
+          </w:p>
+        </w:tc>
+      </w:tr>
+    </w:tbl>
+    <w:p>
+      <w:pPr>
+        <w:spacing w:after="0" w:before="0" w:lineRule="auto"/>
+        <w:rPr>
+          <w:rFonts w:ascii="Arial" w:cs="Arial" w:eastAsia="Arial" w:hAnsi="Arial"/>
+          <w:sz w:val="24"/>
+          <w:szCs w:val="24"/>
+        </w:rPr>
+      </w:pPr>
+    </w:p>
+    <w:p>
+      <w:pPr>
+        <w:spacing w:after="240" w:before="240" w:lineRule="auto"/>
+        <w:rPr>
+          <w:rFonts w:ascii="Arial" w:cs="Arial" w:eastAsia="Arial" w:hAnsi="Arial"/>
+          <w:b w:val="1"/>
+          <w:bCs w:val="1"/>
+          <w:sz w:val="22"/>
+          <w:szCs w:val="22"/>
+        </w:rPr>
+      </w:pPr>
+      <w:r>
+        <w:rPr>
+          <w:rFonts w:ascii="Arial" w:cs="Arial" w:eastAsia="Arial" w:hAnsi="Arial"/>
+          <w:b w:val="1"/>
+          <w:bCs w:val="1"/>
+          <w:sz w:val="22"/>
+          <w:szCs w:val="22"/>
+          <w:rtl w:val="0"/>
+        </w:rPr>
+        <w:t xml:space="preserve">Tabla 7. ¿Conocías los postres sumergidos en nitrógeno liquido en los postres antes de hoy?</w:t>
+      </w:r>
+    </w:p>
+    <w:tbl>
+      <w:tblPr>
+        <w:tblStyle w:val="Tablanormal"/>
+        <w:tblW w:w="9360" w:type="dxa"/>
+        <w:jc w:val="left"/>
+        <w:tblBorders>
+          <w:top w:color="000000" w:space="0" w:sz="4" w:val="single"/>
+          <w:left w:color="000000" w:space="0" w:sz="4" w:val="single"/>
+          <w:bottom w:color="000000" w:space="0" w:sz="4" w:val="single"/>
+          <w:right w:color="000000" w:space="0" w:sz="4" w:val="single"/>
+          <w:insideH w:color="000000" w:space="0" w:sz="4" w:val="single"/>
+          <w:insideV w:color="000000" w:space="0" w:sz="4" w:val="single"/>
+        </w:tblBorders>
+        <w:tblLayout w:type="fixed"/>
+        <w:tblCellMar>
+          <w:top w:w="60" w:type="dxa"/>
+          <w:left w:w="108" w:type="dxa"/>
+          <w:bottom w:w="60" w:type="dxa"/>
+          <w:right w:w="108" w:type="dxa"/>
+        </w:tblCellMar>
+      </w:tblPr>
+      <w:tblGrid>
+        <w:gridCol w:w="4680"/>
+        <w:gridCol w:w="2340"/>
+        <w:gridCol w:w="2340"/>
+      </w:tblGrid>
+      <w:tr>
+        <w:trPr>
+          <w:tblHeader/>
+        </w:trPr>
+        <w:tc>
+          <w:tcPr>
+            <w:tcW w:w="4680" w:type="dxa"/>
+            <w:shd w:fill="D9D9D9" w:val="clear"/>
+            <w:vAlign w:val="center"/>
+          </w:tcPr>
+          <w:p>
+            <w:pPr>
+              <w:spacing w:after="40" w:before="40" w:lineRule="auto"/>
+              <w:jc w:val="left"/>
+              <w:rPr>
+                <w:rFonts w:ascii="Arial" w:cs="Arial" w:eastAsia="Arial" w:hAnsi="Arial"/>
+                <w:b w:val="1"/>
+                <w:bCs w:val="1"/>
+                <w:sz w:val="22"/>
+                <w:szCs w:val="22"/>
+              </w:rPr>
+            </w:pPr>
+            <w:r>
+              <w:rPr>
+                <w:rFonts w:ascii="Arial" w:cs="Arial" w:eastAsia="Arial" w:hAnsi="Arial"/>
+                <w:b w:val="1"/>
+                <w:bCs w:val="1"/>
+                <w:sz w:val="22"/>
+                <w:szCs w:val="22"/>
+                <w:rtl w:val="0"/>
+              </w:rPr>
+              <w:t xml:space="preserve">RESPUESTAS</w:t>
+            </w:r>
+          </w:p>
+        </w:tc>
+        <w:tc>
+          <w:tcPr>
+            <w:tcW w:w="2340" w:type="dxa"/>
+            <w:shd w:fill="D9D9D9" w:val="clear"/>
+            <w:vAlign w:val="center"/>
+          </w:tcPr>
+          <w:p>
+            <w:pPr>
+              <w:spacing w:after="40" w:before="40" w:lineRule="auto"/>
+              <w:jc w:val="center"/>
+              <w:rPr>
+                <w:rFonts w:ascii="Arial" w:cs="Arial" w:eastAsia="Arial" w:hAnsi="Arial"/>
+                <w:b w:val="1"/>
+                <w:bCs w:val="1"/>
+                <w:sz w:val="22"/>
+                <w:szCs w:val="22"/>
+              </w:rPr>
+            </w:pPr>
+            <w:r>
+              <w:rPr>
+                <w:rFonts w:ascii="Arial" w:cs="Arial" w:eastAsia="Arial" w:hAnsi="Arial"/>
+                <w:b w:val="1"/>
+                <w:bCs w:val="1"/>
+                <w:sz w:val="22"/>
+                <w:szCs w:val="22"/>
+                <w:rtl w:val="0"/>
+              </w:rPr>
+              <w:t xml:space="preserve">FRECUENCIAS</w:t>
+            </w:r>
+          </w:p>
+        </w:tc>
+        <w:tc>
+          <w:tcPr>
+            <w:tcW w:w="2340" w:type="dxa"/>
+            <w:shd w:fill="D9D9D9" w:val="clear"/>
+            <w:vAlign w:val="center"/>
+          </w:tcPr>
+          <w:p>
+            <w:pPr>
+              <w:spacing w:after="40" w:before="40" w:lineRule="auto"/>
+              <w:jc w:val="center"/>
+              <w:rPr>
+                <w:rFonts w:ascii="Arial" w:cs="Arial" w:eastAsia="Arial" w:hAnsi="Arial"/>
+                <w:b w:val="1"/>
+                <w:bCs w:val="1"/>
+                <w:sz w:val="22"/>
+                <w:szCs w:val="22"/>
+              </w:rPr>
+            </w:pPr>
+            <w:r>
+              <w:rPr>
+                <w:rFonts w:ascii="Arial" w:cs="Arial" w:eastAsia="Arial" w:hAnsi="Arial"/>
+                <w:b w:val="1"/>
+                <w:bCs w:val="1"/>
+                <w:sz w:val="22"/>
+                <w:szCs w:val="22"/>
+                <w:rtl w:val="0"/>
+              </w:rPr>
+              <w:t xml:space="preserve">%</w:t>
+            </w:r>
+          </w:p>
+        </w:tc>
+      </w:tr>
+      <w:tr>
+        <w:tc>
+          <w:tcPr>
+            <w:tcW w:w="4680" w:type="dxa"/>
+            <w:vAlign w:val="center"/>
+          </w:tcPr>
+          <w:p>
+            <w:pPr>
+              <w:spacing w:after="40" w:before="40" w:lineRule="auto"/>
+              <w:jc w:val="left"/>
+              <w:rPr>
+                <w:rFonts w:ascii="Arial" w:cs="Arial" w:eastAsia="Arial" w:hAnsi="Arial"/>
+                <w:sz w:val="22"/>
+                <w:szCs w:val="22"/>
+              </w:rPr>
+            </w:pPr>
+            <w:r>
+              <w:rPr>
+                <w:rFonts w:ascii="Arial" w:cs="Arial" w:eastAsia="Arial" w:hAnsi="Arial"/>
+                <w:sz w:val="22"/>
+                <w:szCs w:val="22"/>
+                <w:rtl w:val="0"/>
+              </w:rPr>
+              <w:t xml:space="preserve">Si</w:t>
+            </w:r>
+          </w:p>
+        </w:tc>
+        <w:tc>
+          <w:tcPr>
+            <w:tcW w:w="2340" w:type="dxa"/>
+            <w:vAlign w:val="center"/>
+          </w:tcPr>
+          <w:p>
+            <w:pPr>
+              <w:spacing w:after="40" w:before="40" w:lineRule="auto"/>
+              <w:jc w:val="center"/>
+              <w:rPr>
+                <w:rFonts w:ascii="Arial" w:cs="Arial" w:eastAsia="Arial" w:hAnsi="Arial"/>
+                <w:sz w:val="22"/>
+                <w:szCs w:val="22"/>
+              </w:rPr>
+            </w:pPr>
+            <w:r>
+              <w:rPr>
+                <w:rFonts w:ascii="Arial" w:cs="Arial" w:eastAsia="Arial" w:hAnsi="Arial"/>
+                <w:sz w:val="22"/>
+                <w:szCs w:val="22"/>
+                <w:rtl w:val="0"/>
+              </w:rPr>
+              <w:t xml:space="preserve">12</w:t>
+            </w:r>
+          </w:p>
+        </w:tc>
+        <w:tc>
+          <w:tcPr>
+            <w:tcW w:w="2340" w:type="dxa"/>
+            <w:vAlign w:val="center"/>
+          </w:tcPr>
+          <w:p>
+            <w:pPr>
+              <w:spacing w:after="40" w:before="40" w:lineRule="auto"/>
+              <w:jc w:val="center"/>
+              <w:rPr>
+                <w:rFonts w:ascii="Arial" w:cs="Arial" w:eastAsia="Arial" w:hAnsi="Arial"/>
+                <w:sz w:val="22"/>
+                <w:szCs w:val="22"/>
+              </w:rPr>
+            </w:pPr>
+            <w:r>
+              <w:rPr>
+                <w:rFonts w:ascii="Arial" w:cs="Arial" w:eastAsia="Arial" w:hAnsi="Arial"/>
+                <w:sz w:val="22"/>
+                <w:szCs w:val="22"/>
+                <w:rtl w:val="0"/>
+              </w:rPr>
+              <w:t xml:space="preserve">40 %</w:t>
+            </w:r>
+          </w:p>
+        </w:tc>
+      </w:tr>
+      <w:tr>
+        <w:tc>
+          <w:tcPr>
+            <w:tcW w:w="4680" w:type="dxa"/>
+            <w:vAlign w:val="center"/>
+          </w:tcPr>
+          <w:p>
+            <w:pPr>
+              <w:spacing w:after="40" w:before="40" w:lineRule="auto"/>
+              <w:jc w:val="left"/>
+              <w:rPr>
+                <w:rFonts w:ascii="Arial" w:cs="Arial" w:eastAsia="Arial" w:hAnsi="Arial"/>
+                <w:sz w:val="22"/>
+                <w:szCs w:val="22"/>
+              </w:rPr>
+            </w:pPr>
+            <w:r>
+              <w:rPr>
+                <w:rFonts w:ascii="Arial" w:cs="Arial" w:eastAsia="Arial" w:hAnsi="Arial"/>
+                <w:sz w:val="22"/>
+                <w:szCs w:val="22"/>
+                <w:rtl w:val="0"/>
+              </w:rPr>
+              <w:t xml:space="preserve">No</w:t>
+            </w:r>
+          </w:p>
+        </w:tc>
+        <w:tc>
+          <w:tcPr>
+            <w:tcW w:w="2340" w:type="dxa"/>
+            <w:vAlign w:val="center"/>
+          </w:tcPr>
+          <w:p>
+            <w:pPr>
+              <w:spacing w:after="40" w:before="40" w:lineRule="auto"/>
+              <w:jc w:val="center"/>
+              <w:rPr>
+                <w:rFonts w:ascii="Arial" w:cs="Arial" w:eastAsia="Arial" w:hAnsi="Arial"/>
+                <w:sz w:val="22"/>
+                <w:szCs w:val="22"/>
+              </w:rPr>
+            </w:pPr>
+            <w:r>
+              <w:rPr>
+                <w:rFonts w:ascii="Arial" w:cs="Arial" w:eastAsia="Arial" w:hAnsi="Arial"/>
+                <w:sz w:val="22"/>
+                <w:szCs w:val="22"/>
+                <w:rtl w:val="0"/>
+              </w:rPr>
+              <w:t xml:space="preserve">9</w:t>
+            </w:r>
+          </w:p>
+        </w:tc>
+        <w:tc>
+          <w:tcPr>
+            <w:tcW w:w="2340" w:type="dxa"/>
+            <w:vAlign w:val="center"/>
+          </w:tcPr>
+          <w:p>
+            <w:pPr>
+              <w:spacing w:after="40" w:before="40" w:lineRule="auto"/>
+              <w:jc w:val="center"/>
+              <w:rPr>
+                <w:rFonts w:ascii="Arial" w:cs="Arial" w:eastAsia="Arial" w:hAnsi="Arial"/>
+                <w:sz w:val="22"/>
+                <w:szCs w:val="22"/>
+              </w:rPr>
+            </w:pPr>
+            <w:r>
+              <w:rPr>
+                <w:rFonts w:ascii="Arial" w:cs="Arial" w:eastAsia="Arial" w:hAnsi="Arial"/>
+                <w:sz w:val="22"/>
+                <w:szCs w:val="22"/>
+                <w:rtl w:val="0"/>
+              </w:rPr>
+              <w:t xml:space="preserve">30 %</w:t>
+            </w:r>
+          </w:p>
+        </w:tc>
+      </w:tr>
+      <w:tr>
+        <w:tc>
+          <w:tcPr>
+            <w:tcW w:w="4680" w:type="dxa"/>
+            <w:vAlign w:val="center"/>
+          </w:tcPr>
+          <w:p>
+            <w:pPr>
+              <w:spacing w:after="40" w:before="40" w:lineRule="auto"/>
+              <w:jc w:val="left"/>
+              <w:rPr>
+                <w:rFonts w:ascii="Arial" w:cs="Arial" w:eastAsia="Arial" w:hAnsi="Arial"/>
+                <w:sz w:val="22"/>
+                <w:szCs w:val="22"/>
+              </w:rPr>
+            </w:pPr>
+            <w:r>
+              <w:rPr>
+                <w:rFonts w:ascii="Arial" w:cs="Arial" w:eastAsia="Arial" w:hAnsi="Arial"/>
+                <w:sz w:val="22"/>
+                <w:szCs w:val="22"/>
+                <w:rtl w:val="0"/>
+              </w:rPr>
+              <w:t xml:space="preserve">Solo los habia Visto en internet</w:t>
+            </w:r>
+          </w:p>
+        </w:tc>
+        <w:tc>
+          <w:tcPr>
+            <w:tcW w:w="2340" w:type="dxa"/>
+            <w:vAlign w:val="center"/>
+          </w:tcPr>
+          <w:p>
+            <w:pPr>
+              <w:spacing w:after="40" w:before="40" w:lineRule="auto"/>
+              <w:jc w:val="center"/>
+              <w:rPr>
+                <w:rFonts w:ascii="Arial" w:cs="Arial" w:eastAsia="Arial" w:hAnsi="Arial"/>
+                <w:sz w:val="22"/>
+                <w:szCs w:val="22"/>
+              </w:rPr>
+            </w:pPr>
+            <w:r>
+              <w:rPr>
+                <w:rFonts w:ascii="Arial" w:cs="Arial" w:eastAsia="Arial" w:hAnsi="Arial"/>
+                <w:sz w:val="22"/>
+                <w:szCs w:val="22"/>
+                <w:rtl w:val="0"/>
+              </w:rPr>
+              <w:t xml:space="preserve">9</w:t>
+            </w:r>
+          </w:p>
+        </w:tc>
+        <w:tc>
+          <w:tcPr>
+            <w:tcW w:w="2340" w:type="dxa"/>
+            <w:vAlign w:val="center"/>
+          </w:tcPr>
+          <w:p>
+            <w:pPr>
+              <w:spacing w:after="40" w:before="40" w:lineRule="auto"/>
+              <w:jc w:val="center"/>
+              <w:rPr>
+                <w:rFonts w:ascii="Arial" w:cs="Arial" w:eastAsia="Arial" w:hAnsi="Arial"/>
+                <w:sz w:val="22"/>
+                <w:szCs w:val="22"/>
+              </w:rPr>
+            </w:pPr>
+            <w:r>
+              <w:rPr>
+                <w:rFonts w:ascii="Arial" w:cs="Arial" w:eastAsia="Arial" w:hAnsi="Arial"/>
+                <w:sz w:val="22"/>
+                <w:szCs w:val="22"/>
+                <w:rtl w:val="0"/>
+              </w:rPr>
+              <w:t xml:space="preserve">30 %</w:t>
+            </w:r>
+          </w:p>
+        </w:tc>
+      </w:tr>
+      <w:tr>
+        <w:tc>
+          <w:tcPr>
+            <w:tcW w:w="4680" w:type="dxa"/>
+            <w:shd w:fill="F2F2F2" w:val="clear"/>
+            <w:vAlign w:val="center"/>
+          </w:tcPr>
+          <w:p>
+            <w:pPr>
+              <w:spacing w:after="40" w:before="40" w:lineRule="auto"/>
+              <w:jc w:val="left"/>
+              <w:rPr>
+                <w:rFonts w:ascii="Arial" w:cs="Arial" w:eastAsia="Arial" w:hAnsi="Arial"/>
+                <w:b w:val="1"/>
+                <w:bCs w:val="1"/>
+                <w:sz w:val="22"/>
+                <w:szCs w:val="22"/>
+              </w:rPr>
+            </w:pPr>
+            <w:r>
+              <w:rPr>
+                <w:rFonts w:ascii="Arial" w:cs="Arial" w:eastAsia="Arial" w:hAnsi="Arial"/>
+                <w:b w:val="1"/>
+                <w:bCs w:val="1"/>
+                <w:sz w:val="22"/>
+                <w:szCs w:val="22"/>
+                <w:rtl w:val="0"/>
+              </w:rPr>
+              <w:t xml:space="preserve">TOTAL</w:t>
+            </w:r>
+          </w:p>
+        </w:tc>
+        <w:tc>
+          <w:tcPr>
+            <w:tcW w:w="2340" w:type="dxa"/>
+            <w:shd w:fill="F2F2F2" w:val="clear"/>
+            <w:vAlign w:val="center"/>
+          </w:tcPr>
+          <w:p>
+            <w:pPr>
+              <w:spacing w:after="40" w:before="40" w:lineRule="auto"/>
+              <w:jc w:val="center"/>
+              <w:rPr>
+                <w:rFonts w:ascii="Arial" w:cs="Arial" w:eastAsia="Arial" w:hAnsi="Arial"/>
+                <w:b w:val="1"/>
+                <w:bCs w:val="1"/>
+                <w:sz w:val="22"/>
+                <w:szCs w:val="22"/>
+              </w:rPr>
+            </w:pPr>
+            <w:r>
+              <w:rPr>
+                <w:rFonts w:ascii="Arial" w:cs="Arial" w:eastAsia="Arial" w:hAnsi="Arial"/>
+                <w:b w:val="1"/>
+                <w:bCs w:val="1"/>
+                <w:sz w:val="22"/>
+                <w:szCs w:val="22"/>
+                <w:rtl w:val="0"/>
+              </w:rPr>
+              <w:t xml:space="preserve">30</w:t>
+            </w:r>
+          </w:p>
+        </w:tc>
+        <w:tc>
+          <w:tcPr>
+            <w:tcW w:w="2340" w:type="dxa"/>
+            <w:shd w:fill="F2F2F2" w:val="clear"/>
+            <w:vAlign w:val="center"/>
+          </w:tcPr>
+          <w:p>
+            <w:pPr>
+              <w:spacing w:after="40" w:before="40" w:lineRule="auto"/>
+              <w:jc w:val="center"/>
+              <w:rPr>
+                <w:rFonts w:ascii="Arial" w:cs="Arial" w:eastAsia="Arial" w:hAnsi="Arial"/>
+                <w:b w:val="1"/>
+                <w:bCs w:val="1"/>
+                <w:sz w:val="22"/>
+                <w:szCs w:val="22"/>
+              </w:rPr>
+            </w:pPr>
+            <w:r>
+              <w:rPr>
+                <w:rFonts w:ascii="Arial" w:cs="Arial" w:eastAsia="Arial" w:hAnsi="Arial"/>
+                <w:b w:val="1"/>
+                <w:bCs w:val="1"/>
+                <w:sz w:val="22"/>
+                <w:szCs w:val="22"/>
+                <w:rtl w:val="0"/>
+              </w:rPr>
+              <w:t xml:space="preserve">100 %</w:t>
+            </w:r>
+          </w:p>
+        </w:tc>
+      </w:tr>
+    </w:tbl>
+    <w:p>
+      <w:pPr>
+        <w:spacing w:after="0" w:before="0" w:lineRule="auto"/>
+        <w:rPr>
+          <w:rFonts w:ascii="Arial" w:cs="Arial" w:eastAsia="Arial" w:hAnsi="Arial"/>
+          <w:sz w:val="24"/>
+          <w:szCs w:val="24"/>
+        </w:rPr>
+      </w:pPr>
+    </w:p>
+    <w:p>
+      <w:pPr>
+        <w:spacing w:after="240" w:before="240" w:lineRule="auto"/>
+        <w:rPr>
+          <w:rFonts w:ascii="Arial" w:cs="Arial" w:eastAsia="Arial" w:hAnsi="Arial"/>
+          <w:b w:val="1"/>
+          <w:bCs w:val="1"/>
+          <w:sz w:val="22"/>
+          <w:szCs w:val="22"/>
+        </w:rPr>
+      </w:pPr>
+      <w:r>
+        <w:rPr>
+          <w:rFonts w:ascii="Arial" w:cs="Arial" w:eastAsia="Arial" w:hAnsi="Arial"/>
+          <w:b w:val="1"/>
+          <w:bCs w:val="1"/>
+          <w:sz w:val="22"/>
+          <w:szCs w:val="22"/>
+          <w:rtl w:val="0"/>
+        </w:rPr>
+        <w:t xml:space="preserve">Tabla 8. ¿Te gustaría mirar la preparación de como se sumerje el mochi bajo nitrógeno liquido</w:t>
+      </w:r>
+    </w:p>
+    <w:tbl>
+      <w:tblPr>
+        <w:tblStyle w:val="Tablanormal"/>
+        <w:tblW w:w="9360" w:type="dxa"/>
+        <w:jc w:val="left"/>
+        <w:tblBorders>
+          <w:top w:color="000000" w:space="0" w:sz="4" w:val="single"/>
+          <w:left w:color="000000" w:space="0" w:sz="4" w:val="single"/>
+          <w:bottom w:color="000000" w:space="0" w:sz="4" w:val="single"/>
+          <w:right w:color="000000" w:space="0" w:sz="4" w:val="single"/>
+          <w:insideH w:color="000000" w:space="0" w:sz="4" w:val="single"/>
+          <w:insideV w:color="000000" w:space="0" w:sz="4" w:val="single"/>
+        </w:tblBorders>
+        <w:tblLayout w:type="fixed"/>
+        <w:tblCellMar>
+          <w:top w:w="60" w:type="dxa"/>
+          <w:left w:w="108" w:type="dxa"/>
+          <w:bottom w:w="60" w:type="dxa"/>
+          <w:right w:w="108" w:type="dxa"/>
+        </w:tblCellMar>
+      </w:tblPr>
+      <w:tblGrid>
+        <w:gridCol w:w="4680"/>
+        <w:gridCol w:w="2340"/>
+        <w:gridCol w:w="2340"/>
+      </w:tblGrid>
+      <w:tr>
+        <w:trPr>
+          <w:tblHeader/>
+        </w:trPr>
+        <w:tc>
+          <w:tcPr>
+            <w:tcW w:w="4680" w:type="dxa"/>
+            <w:shd w:fill="D9D9D9" w:val="clear"/>
+            <w:vAlign w:val="center"/>
+          </w:tcPr>
+          <w:p>
+            <w:pPr>
+              <w:spacing w:after="40" w:before="40" w:lineRule="auto"/>
+              <w:jc w:val="left"/>
+              <w:rPr>
+                <w:rFonts w:ascii="Arial" w:cs="Arial" w:eastAsia="Arial" w:hAnsi="Arial"/>
+                <w:b w:val="1"/>
+                <w:bCs w:val="1"/>
+                <w:sz w:val="22"/>
+                <w:szCs w:val="22"/>
+              </w:rPr>
+            </w:pPr>
+            <w:r>
+              <w:rPr>
+                <w:rFonts w:ascii="Arial" w:cs="Arial" w:eastAsia="Arial" w:hAnsi="Arial"/>
+                <w:b w:val="1"/>
+                <w:bCs w:val="1"/>
+                <w:sz w:val="22"/>
+                <w:szCs w:val="22"/>
+                <w:rtl w:val="0"/>
+              </w:rPr>
+              <w:t xml:space="preserve">RESPUESTAS</w:t>
+            </w:r>
+          </w:p>
+        </w:tc>
+        <w:tc>
+          <w:tcPr>
+            <w:tcW w:w="2340" w:type="dxa"/>
+            <w:shd w:fill="D9D9D9" w:val="clear"/>
+            <w:vAlign w:val="center"/>
+          </w:tcPr>
+          <w:p>
+            <w:pPr>
+              <w:spacing w:after="40" w:before="40" w:lineRule="auto"/>
+              <w:jc w:val="center"/>
+              <w:rPr>
+                <w:rFonts w:ascii="Arial" w:cs="Arial" w:eastAsia="Arial" w:hAnsi="Arial"/>
+                <w:b w:val="1"/>
+                <w:bCs w:val="1"/>
+                <w:sz w:val="22"/>
+                <w:szCs w:val="22"/>
+              </w:rPr>
+            </w:pPr>
+            <w:r>
+              <w:rPr>
+                <w:rFonts w:ascii="Arial" w:cs="Arial" w:eastAsia="Arial" w:hAnsi="Arial"/>
+                <w:b w:val="1"/>
+                <w:bCs w:val="1"/>
+                <w:sz w:val="22"/>
+                <w:szCs w:val="22"/>
+                <w:rtl w:val="0"/>
+              </w:rPr>
+              <w:t xml:space="preserve">FRECUENCIAS</w:t>
+            </w:r>
+          </w:p>
+        </w:tc>
+        <w:tc>
+          <w:tcPr>
+            <w:tcW w:w="2340" w:type="dxa"/>
+            <w:shd w:fill="D9D9D9" w:val="clear"/>
+            <w:vAlign w:val="center"/>
+          </w:tcPr>
+          <w:p>
+            <w:pPr>
+              <w:spacing w:after="40" w:before="40" w:lineRule="auto"/>
+              <w:jc w:val="center"/>
+              <w:rPr>
+                <w:rFonts w:ascii="Arial" w:cs="Arial" w:eastAsia="Arial" w:hAnsi="Arial"/>
+                <w:b w:val="1"/>
+                <w:bCs w:val="1"/>
+                <w:sz w:val="22"/>
+                <w:szCs w:val="22"/>
+              </w:rPr>
+            </w:pPr>
+            <w:r>
+              <w:rPr>
+                <w:rFonts w:ascii="Arial" w:cs="Arial" w:eastAsia="Arial" w:hAnsi="Arial"/>
+                <w:b w:val="1"/>
+                <w:bCs w:val="1"/>
+                <w:sz w:val="22"/>
+                <w:szCs w:val="22"/>
+                <w:rtl w:val="0"/>
+              </w:rPr>
+              <w:t xml:space="preserve">%</w:t>
+            </w:r>
+          </w:p>
+        </w:tc>
+      </w:tr>
+      <w:tr>
+        <w:tc>
+          <w:tcPr>
+            <w:tcW w:w="4680" w:type="dxa"/>
+            <w:vAlign w:val="center"/>
+          </w:tcPr>
+          <w:p>
+            <w:pPr>
+              <w:spacing w:after="40" w:before="40" w:lineRule="auto"/>
+              <w:jc w:val="left"/>
+              <w:rPr>
+                <w:rFonts w:ascii="Arial" w:cs="Arial" w:eastAsia="Arial" w:hAnsi="Arial"/>
+                <w:sz w:val="22"/>
+                <w:szCs w:val="22"/>
+              </w:rPr>
+            </w:pPr>
+            <w:r>
+              <w:rPr>
+                <w:rFonts w:ascii="Arial" w:cs="Arial" w:eastAsia="Arial" w:hAnsi="Arial"/>
+                <w:sz w:val="22"/>
+                <w:szCs w:val="22"/>
+                <w:rtl w:val="0"/>
+              </w:rPr>
+              <w:t xml:space="preserve">Si</w:t>
+            </w:r>
+          </w:p>
+        </w:tc>
+        <w:tc>
+          <w:tcPr>
+            <w:tcW w:w="2340" w:type="dxa"/>
+            <w:vAlign w:val="center"/>
+          </w:tcPr>
+          <w:p>
+            <w:pPr>
+              <w:spacing w:after="40" w:before="40" w:lineRule="auto"/>
+              <w:jc w:val="center"/>
+              <w:rPr>
+                <w:rFonts w:ascii="Arial" w:cs="Arial" w:eastAsia="Arial" w:hAnsi="Arial"/>
+                <w:sz w:val="22"/>
+                <w:szCs w:val="22"/>
+              </w:rPr>
+            </w:pPr>
+            <w:r>
+              <w:rPr>
+                <w:rFonts w:ascii="Arial" w:cs="Arial" w:eastAsia="Arial" w:hAnsi="Arial"/>
+                <w:sz w:val="22"/>
+                <w:szCs w:val="22"/>
+                <w:rtl w:val="0"/>
+              </w:rPr>
+              <w:t xml:space="preserve">24</w:t>
+            </w:r>
+          </w:p>
+        </w:tc>
+        <w:tc>
+          <w:tcPr>
+            <w:tcW w:w="2340" w:type="dxa"/>
+            <w:vAlign w:val="center"/>
+          </w:tcPr>
+          <w:p>
+            <w:pPr>
+              <w:spacing w:after="40" w:before="40" w:lineRule="auto"/>
+              <w:jc w:val="center"/>
+              <w:rPr>
+                <w:rFonts w:ascii="Arial" w:cs="Arial" w:eastAsia="Arial" w:hAnsi="Arial"/>
+                <w:sz w:val="22"/>
+                <w:szCs w:val="22"/>
+              </w:rPr>
+            </w:pPr>
+            <w:r>
+              <w:rPr>
+                <w:rFonts w:ascii="Arial" w:cs="Arial" w:eastAsia="Arial" w:hAnsi="Arial"/>
+                <w:sz w:val="22"/>
+                <w:szCs w:val="22"/>
+                <w:rtl w:val="0"/>
+              </w:rPr>
+              <w:t xml:space="preserve">80 %</w:t>
+            </w:r>
+          </w:p>
+        </w:tc>
+      </w:tr>
+      <w:tr>
+        <w:tc>
+          <w:tcPr>
+            <w:tcW w:w="4680" w:type="dxa"/>
+            <w:vAlign w:val="center"/>
+          </w:tcPr>
+          <w:p>
+            <w:pPr>
+              <w:spacing w:after="40" w:before="40" w:lineRule="auto"/>
+              <w:jc w:val="left"/>
+              <w:rPr>
+                <w:rFonts w:ascii="Arial" w:cs="Arial" w:eastAsia="Arial" w:hAnsi="Arial"/>
+                <w:sz w:val="22"/>
+                <w:szCs w:val="22"/>
+              </w:rPr>
+            </w:pPr>
+            <w:r>
+              <w:rPr>
+                <w:rFonts w:ascii="Arial" w:cs="Arial" w:eastAsia="Arial" w:hAnsi="Arial"/>
+                <w:sz w:val="22"/>
+                <w:szCs w:val="22"/>
+                <w:rtl w:val="0"/>
+              </w:rPr>
+              <w:t xml:space="preserve">No</w:t>
+            </w:r>
+          </w:p>
+        </w:tc>
+        <w:tc>
+          <w:tcPr>
+            <w:tcW w:w="2340" w:type="dxa"/>
+            <w:vAlign w:val="center"/>
+          </w:tcPr>
+          <w:p>
+            <w:pPr>
+              <w:spacing w:after="40" w:before="40" w:lineRule="auto"/>
+              <w:jc w:val="center"/>
+              <w:rPr>
+                <w:rFonts w:ascii="Arial" w:cs="Arial" w:eastAsia="Arial" w:hAnsi="Arial"/>
+                <w:sz w:val="22"/>
+                <w:szCs w:val="22"/>
+              </w:rPr>
+            </w:pPr>
+            <w:r>
+              <w:rPr>
+                <w:rFonts w:ascii="Arial" w:cs="Arial" w:eastAsia="Arial" w:hAnsi="Arial"/>
+                <w:sz w:val="22"/>
+                <w:szCs w:val="22"/>
+                <w:rtl w:val="0"/>
+              </w:rPr>
+              <w:t xml:space="preserve">6</w:t>
+            </w:r>
+          </w:p>
+        </w:tc>
+        <w:tc>
+          <w:tcPr>
+            <w:tcW w:w="2340" w:type="dxa"/>
+            <w:vAlign w:val="center"/>
+          </w:tcPr>
+          <w:p>
+            <w:pPr>
+              <w:spacing w:after="40" w:before="40" w:lineRule="auto"/>
+              <w:jc w:val="center"/>
+              <w:rPr>
+                <w:rFonts w:ascii="Arial" w:cs="Arial" w:eastAsia="Arial" w:hAnsi="Arial"/>
+                <w:sz w:val="22"/>
+                <w:szCs w:val="22"/>
+              </w:rPr>
+            </w:pPr>
+            <w:r>
+              <w:rPr>
+                <w:rFonts w:ascii="Arial" w:cs="Arial" w:eastAsia="Arial" w:hAnsi="Arial"/>
+                <w:sz w:val="22"/>
+                <w:szCs w:val="22"/>
+                <w:rtl w:val="0"/>
+              </w:rPr>
+              <w:t xml:space="preserve">20 %</w:t>
+            </w:r>
+          </w:p>
+        </w:tc>
+      </w:tr>
+      <w:tr>
+        <w:tc>
+          <w:tcPr>
+            <w:tcW w:w="4680" w:type="dxa"/>
+            <w:shd w:fill="F2F2F2" w:val="clear"/>
+            <w:vAlign w:val="center"/>
+          </w:tcPr>
+          <w:p>
+            <w:pPr>
+              <w:spacing w:after="40" w:before="40" w:lineRule="auto"/>
+              <w:jc w:val="left"/>
+              <w:rPr>
+                <w:rFonts w:ascii="Arial" w:cs="Arial" w:eastAsia="Arial" w:hAnsi="Arial"/>
+                <w:b w:val="1"/>
+                <w:bCs w:val="1"/>
+                <w:sz w:val="22"/>
+                <w:szCs w:val="22"/>
+              </w:rPr>
+            </w:pPr>
+            <w:r>
+              <w:rPr>
+                <w:rFonts w:ascii="Arial" w:cs="Arial" w:eastAsia="Arial" w:hAnsi="Arial"/>
+                <w:b w:val="1"/>
+                <w:bCs w:val="1"/>
+                <w:sz w:val="22"/>
+                <w:szCs w:val="22"/>
+                <w:rtl w:val="0"/>
+              </w:rPr>
+              <w:t xml:space="preserve">TOTAL</w:t>
+            </w:r>
+          </w:p>
+        </w:tc>
+        <w:tc>
+          <w:tcPr>
+            <w:tcW w:w="2340" w:type="dxa"/>
+            <w:shd w:fill="F2F2F2" w:val="clear"/>
+            <w:vAlign w:val="center"/>
+          </w:tcPr>
+          <w:p>
+            <w:pPr>
+              <w:spacing w:after="40" w:before="40" w:lineRule="auto"/>
+              <w:jc w:val="center"/>
+              <w:rPr>
+                <w:rFonts w:ascii="Arial" w:cs="Arial" w:eastAsia="Arial" w:hAnsi="Arial"/>
+                <w:b w:val="1"/>
+                <w:bCs w:val="1"/>
+                <w:sz w:val="22"/>
+                <w:szCs w:val="22"/>
+              </w:rPr>
+            </w:pPr>
+            <w:r>
+              <w:rPr>
+                <w:rFonts w:ascii="Arial" w:cs="Arial" w:eastAsia="Arial" w:hAnsi="Arial"/>
+                <w:b w:val="1"/>
+                <w:bCs w:val="1"/>
+                <w:sz w:val="22"/>
+                <w:szCs w:val="22"/>
+                <w:rtl w:val="0"/>
+              </w:rPr>
+              <w:t xml:space="preserve">30</w:t>
+            </w:r>
+          </w:p>
+        </w:tc>
+        <w:tc>
+          <w:tcPr>
+            <w:tcW w:w="2340" w:type="dxa"/>
+            <w:shd w:fill="F2F2F2" w:val="clear"/>
+            <w:vAlign w:val="center"/>
+          </w:tcPr>
+          <w:p>
+            <w:pPr>
+              <w:spacing w:after="40" w:before="40" w:lineRule="auto"/>
+              <w:jc w:val="center"/>
+              <w:rPr>
+                <w:rFonts w:ascii="Arial" w:cs="Arial" w:eastAsia="Arial" w:hAnsi="Arial"/>
+                <w:b w:val="1"/>
+                <w:bCs w:val="1"/>
+                <w:sz w:val="22"/>
+                <w:szCs w:val="22"/>
+              </w:rPr>
+            </w:pPr>
+            <w:r>
+              <w:rPr>
+                <w:rFonts w:ascii="Arial" w:cs="Arial" w:eastAsia="Arial" w:hAnsi="Arial"/>
+                <w:b w:val="1"/>
+                <w:bCs w:val="1"/>
+                <w:sz w:val="22"/>
+                <w:szCs w:val="22"/>
+                <w:rtl w:val="0"/>
+              </w:rPr>
+              <w:t xml:space="preserve">100 %</w:t>
+            </w:r>
+          </w:p>
+        </w:tc>
+      </w:tr>
+    </w:tbl>
+    <w:p>
+      <w:pPr>
+        <w:spacing w:after="0" w:before="0" w:lineRule="auto"/>
+        <w:rPr>
+          <w:rFonts w:ascii="Arial" w:cs="Arial" w:eastAsia="Arial" w:hAnsi="Arial"/>
+          <w:sz w:val="24"/>
+          <w:szCs w:val="24"/>
+        </w:rPr>
+      </w:pPr>
+    </w:p>
+    <w:p>
+      <w:pPr>
+        <w:spacing w:after="240" w:before="240" w:lineRule="auto"/>
+        <w:rPr>
+          <w:rFonts w:ascii="Arial" w:cs="Arial" w:eastAsia="Arial" w:hAnsi="Arial"/>
+          <w:b w:val="1"/>
+          <w:bCs w:val="1"/>
+          <w:sz w:val="22"/>
+          <w:szCs w:val="22"/>
+        </w:rPr>
+      </w:pPr>
+      <w:r>
+        <w:rPr>
+          <w:rFonts w:ascii="Arial" w:cs="Arial" w:eastAsia="Arial" w:hAnsi="Arial"/>
+          <w:b w:val="1"/>
+          <w:bCs w:val="1"/>
+          <w:sz w:val="22"/>
+          <w:szCs w:val="22"/>
+          <w:rtl w:val="0"/>
+        </w:rPr>
+        <w:t xml:space="preserve">Tabla 9. ¿Consideras que el Nitrógeno liquido es algo innovador para la implementación en la comida además de los postres y cócteles?</w:t>
+      </w:r>
+    </w:p>
+    <w:tbl>
+      <w:tblPr>
+        <w:tblStyle w:val="Tablanormal"/>
+        <w:tblW w:w="9360" w:type="dxa"/>
+        <w:jc w:val="left"/>
+        <w:tblBorders>
+          <w:top w:color="000000" w:space="0" w:sz="4" w:val="single"/>
+          <w:left w:color="000000" w:space="0" w:sz="4" w:val="single"/>
+          <w:bottom w:color="000000" w:space="0" w:sz="4" w:val="single"/>
+          <w:right w:color="000000" w:space="0" w:sz="4" w:val="single"/>
+          <w:insideH w:color="000000" w:space="0" w:sz="4" w:val="single"/>
+          <w:insideV w:color="000000" w:space="0" w:sz="4" w:val="single"/>
+        </w:tblBorders>
+        <w:tblLayout w:type="fixed"/>
+        <w:tblCellMar>
+          <w:top w:w="60" w:type="dxa"/>
+          <w:left w:w="108" w:type="dxa"/>
+          <w:bottom w:w="60" w:type="dxa"/>
+          <w:right w:w="108" w:type="dxa"/>
+        </w:tblCellMar>
+      </w:tblPr>
+      <w:tblGrid>
+        <w:gridCol w:w="4680"/>
+        <w:gridCol w:w="2340"/>
+        <w:gridCol w:w="2340"/>
+      </w:tblGrid>
+      <w:tr>
+        <w:trPr>
+          <w:tblHeader/>
+        </w:trPr>
+        <w:tc>
+          <w:tcPr>
+            <w:tcW w:w="4680" w:type="dxa"/>
+            <w:shd w:fill="D9D9D9" w:val="clear"/>
+            <w:vAlign w:val="center"/>
+          </w:tcPr>
+          <w:p>
+            <w:pPr>
+              <w:spacing w:after="40" w:before="40" w:lineRule="auto"/>
+              <w:jc w:val="left"/>
+              <w:rPr>
+                <w:rFonts w:ascii="Arial" w:cs="Arial" w:eastAsia="Arial" w:hAnsi="Arial"/>
+                <w:b w:val="1"/>
+                <w:bCs w:val="1"/>
+                <w:sz w:val="22"/>
+                <w:szCs w:val="22"/>
+              </w:rPr>
+            </w:pPr>
+            <w:r>
+              <w:rPr>
+                <w:rFonts w:ascii="Arial" w:cs="Arial" w:eastAsia="Arial" w:hAnsi="Arial"/>
+                <w:b w:val="1"/>
+                <w:bCs w:val="1"/>
+                <w:sz w:val="22"/>
+                <w:szCs w:val="22"/>
+                <w:rtl w:val="0"/>
+              </w:rPr>
+              <w:t xml:space="preserve">RESPUESTAS</w:t>
+            </w:r>
+          </w:p>
+        </w:tc>
+        <w:tc>
+          <w:tcPr>
+            <w:tcW w:w="2340" w:type="dxa"/>
+            <w:shd w:fill="D9D9D9" w:val="clear"/>
+            <w:vAlign w:val="center"/>
+          </w:tcPr>
+          <w:p>
+            <w:pPr>
+              <w:spacing w:after="40" w:before="40" w:lineRule="auto"/>
+              <w:jc w:val="center"/>
+              <w:rPr>
+                <w:rFonts w:ascii="Arial" w:cs="Arial" w:eastAsia="Arial" w:hAnsi="Arial"/>
+                <w:b w:val="1"/>
+                <w:bCs w:val="1"/>
+                <w:sz w:val="22"/>
+                <w:szCs w:val="22"/>
+              </w:rPr>
+            </w:pPr>
+            <w:r>
+              <w:rPr>
+                <w:rFonts w:ascii="Arial" w:cs="Arial" w:eastAsia="Arial" w:hAnsi="Arial"/>
+                <w:b w:val="1"/>
+                <w:bCs w:val="1"/>
+                <w:sz w:val="22"/>
+                <w:szCs w:val="22"/>
+                <w:rtl w:val="0"/>
+              </w:rPr>
+              <w:t xml:space="preserve">FRECUENCIAS</w:t>
+            </w:r>
+          </w:p>
+        </w:tc>
+        <w:tc>
+          <w:tcPr>
+            <w:tcW w:w="2340" w:type="dxa"/>
+            <w:shd w:fill="D9D9D9" w:val="clear"/>
+            <w:vAlign w:val="center"/>
+          </w:tcPr>
+          <w:p>
+            <w:pPr>
+              <w:spacing w:after="40" w:before="40" w:lineRule="auto"/>
+              <w:jc w:val="center"/>
+              <w:rPr>
+                <w:rFonts w:ascii="Arial" w:cs="Arial" w:eastAsia="Arial" w:hAnsi="Arial"/>
+                <w:b w:val="1"/>
+                <w:bCs w:val="1"/>
+                <w:sz w:val="22"/>
+                <w:szCs w:val="22"/>
+              </w:rPr>
+            </w:pPr>
+            <w:r>
+              <w:rPr>
+                <w:rFonts w:ascii="Arial" w:cs="Arial" w:eastAsia="Arial" w:hAnsi="Arial"/>
+                <w:b w:val="1"/>
+                <w:bCs w:val="1"/>
+                <w:sz w:val="22"/>
+                <w:szCs w:val="22"/>
+                <w:rtl w:val="0"/>
+              </w:rPr>
+              <w:t xml:space="preserve">%</w:t>
+            </w:r>
+          </w:p>
+        </w:tc>
+      </w:tr>
+      <w:tr>
+        <w:tc>
+          <w:tcPr>
+            <w:tcW w:w="4680" w:type="dxa"/>
+            <w:vAlign w:val="center"/>
+          </w:tcPr>
+          <w:p>
+            <w:pPr>
+              <w:spacing w:after="40" w:before="40" w:lineRule="auto"/>
+              <w:jc w:val="left"/>
+              <w:rPr>
+                <w:rFonts w:ascii="Arial" w:cs="Arial" w:eastAsia="Arial" w:hAnsi="Arial"/>
+                <w:sz w:val="22"/>
+                <w:szCs w:val="22"/>
+              </w:rPr>
+            </w:pPr>
+            <w:r>
+              <w:rPr>
+                <w:rFonts w:ascii="Arial" w:cs="Arial" w:eastAsia="Arial" w:hAnsi="Arial"/>
+                <w:sz w:val="22"/>
+                <w:szCs w:val="22"/>
+                <w:rtl w:val="0"/>
+              </w:rPr>
+              <w:t xml:space="preserve">Si</w:t>
+            </w:r>
+          </w:p>
+        </w:tc>
+        <w:tc>
+          <w:tcPr>
+            <w:tcW w:w="2340" w:type="dxa"/>
+            <w:vAlign w:val="center"/>
+          </w:tcPr>
+          <w:p>
+            <w:pPr>
+              <w:spacing w:after="40" w:before="40" w:lineRule="auto"/>
+              <w:jc w:val="center"/>
+              <w:rPr>
+                <w:rFonts w:ascii="Arial" w:cs="Arial" w:eastAsia="Arial" w:hAnsi="Arial"/>
+                <w:sz w:val="22"/>
+                <w:szCs w:val="22"/>
+              </w:rPr>
+            </w:pPr>
+            <w:r>
+              <w:rPr>
+                <w:rFonts w:ascii="Arial" w:cs="Arial" w:eastAsia="Arial" w:hAnsi="Arial"/>
+                <w:sz w:val="22"/>
+                <w:szCs w:val="22"/>
+                <w:rtl w:val="0"/>
+              </w:rPr>
+              <w:t xml:space="preserve">22</w:t>
+            </w:r>
+          </w:p>
+        </w:tc>
+        <w:tc>
+          <w:tcPr>
+            <w:tcW w:w="2340" w:type="dxa"/>
+            <w:vAlign w:val="center"/>
+          </w:tcPr>
+          <w:p>
+            <w:pPr>
+              <w:spacing w:after="40" w:before="40" w:lineRule="auto"/>
+              <w:jc w:val="center"/>
+              <w:rPr>
+                <w:rFonts w:ascii="Arial" w:cs="Arial" w:eastAsia="Arial" w:hAnsi="Arial"/>
+                <w:sz w:val="22"/>
+                <w:szCs w:val="22"/>
+              </w:rPr>
+            </w:pPr>
+            <w:r>
+              <w:rPr>
+                <w:rFonts w:ascii="Arial" w:cs="Arial" w:eastAsia="Arial" w:hAnsi="Arial"/>
+                <w:sz w:val="22"/>
+                <w:szCs w:val="22"/>
+                <w:rtl w:val="0"/>
+              </w:rPr>
+              <w:t xml:space="preserve">73 %</w:t>
+            </w:r>
+          </w:p>
+        </w:tc>
+      </w:tr>
+      <w:tr>
+        <w:tc>
+          <w:tcPr>
+            <w:tcW w:w="4680" w:type="dxa"/>
+            <w:vAlign w:val="center"/>
+          </w:tcPr>
+          <w:p>
+            <w:pPr>
+              <w:spacing w:after="40" w:before="40" w:lineRule="auto"/>
+              <w:jc w:val="left"/>
+              <w:rPr>
+                <w:rFonts w:ascii="Arial" w:cs="Arial" w:eastAsia="Arial" w:hAnsi="Arial"/>
+                <w:sz w:val="22"/>
+                <w:szCs w:val="22"/>
+              </w:rPr>
+            </w:pPr>
+            <w:r>
+              <w:rPr>
+                <w:rFonts w:ascii="Arial" w:cs="Arial" w:eastAsia="Arial" w:hAnsi="Arial"/>
+                <w:sz w:val="22"/>
+                <w:szCs w:val="22"/>
+                <w:rtl w:val="0"/>
+              </w:rPr>
+              <w:t xml:space="preserve">No</w:t>
+            </w:r>
+          </w:p>
+        </w:tc>
+        <w:tc>
+          <w:tcPr>
+            <w:tcW w:w="2340" w:type="dxa"/>
+            <w:vAlign w:val="center"/>
+          </w:tcPr>
+          <w:p>
+            <w:pPr>
+              <w:spacing w:after="40" w:before="40" w:lineRule="auto"/>
+              <w:jc w:val="center"/>
+              <w:rPr>
+                <w:rFonts w:ascii="Arial" w:cs="Arial" w:eastAsia="Arial" w:hAnsi="Arial"/>
+                <w:sz w:val="22"/>
+                <w:szCs w:val="22"/>
+              </w:rPr>
+            </w:pPr>
+            <w:r>
+              <w:rPr>
+                <w:rFonts w:ascii="Arial" w:cs="Arial" w:eastAsia="Arial" w:hAnsi="Arial"/>
+                <w:sz w:val="22"/>
+                <w:szCs w:val="22"/>
+                <w:rtl w:val="0"/>
+              </w:rPr>
+              <w:t xml:space="preserve">8</w:t>
+            </w:r>
+          </w:p>
+        </w:tc>
+        <w:tc>
+          <w:tcPr>
+            <w:tcW w:w="2340" w:type="dxa"/>
+            <w:vAlign w:val="center"/>
+          </w:tcPr>
+          <w:p>
+            <w:pPr>
+              <w:spacing w:after="40" w:before="40" w:lineRule="auto"/>
+              <w:jc w:val="center"/>
+              <w:rPr>
+                <w:rFonts w:ascii="Arial" w:cs="Arial" w:eastAsia="Arial" w:hAnsi="Arial"/>
+                <w:sz w:val="22"/>
+                <w:szCs w:val="22"/>
+              </w:rPr>
+            </w:pPr>
+            <w:r>
+              <w:rPr>
+                <w:rFonts w:ascii="Arial" w:cs="Arial" w:eastAsia="Arial" w:hAnsi="Arial"/>
+                <w:sz w:val="22"/>
+                <w:szCs w:val="22"/>
+                <w:rtl w:val="0"/>
+              </w:rPr>
+              <w:t xml:space="preserve">27 %</w:t>
+            </w:r>
+          </w:p>
+        </w:tc>
+      </w:tr>
+      <w:tr>
+        <w:tc>
+          <w:tcPr>
+            <w:tcW w:w="4680" w:type="dxa"/>
+            <w:shd w:fill="F2F2F2" w:val="clear"/>
+            <w:vAlign w:val="center"/>
+          </w:tcPr>
+          <w:p>
+            <w:pPr>
+              <w:spacing w:after="40" w:before="40" w:lineRule="auto"/>
+              <w:jc w:val="left"/>
+              <w:rPr>
+                <w:rFonts w:ascii="Arial" w:cs="Arial" w:eastAsia="Arial" w:hAnsi="Arial"/>
+                <w:b w:val="1"/>
+                <w:bCs w:val="1"/>
+                <w:sz w:val="22"/>
+                <w:szCs w:val="22"/>
+              </w:rPr>
+            </w:pPr>
+            <w:r>
+              <w:rPr>
+                <w:rFonts w:ascii="Arial" w:cs="Arial" w:eastAsia="Arial" w:hAnsi="Arial"/>
+                <w:b w:val="1"/>
+                <w:bCs w:val="1"/>
+                <w:sz w:val="22"/>
+                <w:szCs w:val="22"/>
+                <w:rtl w:val="0"/>
+              </w:rPr>
+              <w:t xml:space="preserve">TOTAL</w:t>
+            </w:r>
+          </w:p>
+        </w:tc>
+        <w:tc>
+          <w:tcPr>
+            <w:tcW w:w="2340" w:type="dxa"/>
+            <w:shd w:fill="F2F2F2" w:val="clear"/>
+            <w:vAlign w:val="center"/>
+          </w:tcPr>
+          <w:p>
+            <w:pPr>
+              <w:spacing w:after="40" w:before="40" w:lineRule="auto"/>
+              <w:jc w:val="center"/>
+              <w:rPr>
+                <w:rFonts w:ascii="Arial" w:cs="Arial" w:eastAsia="Arial" w:hAnsi="Arial"/>
+                <w:b w:val="1"/>
+                <w:bCs w:val="1"/>
+                <w:sz w:val="22"/>
+                <w:szCs w:val="22"/>
+              </w:rPr>
+            </w:pPr>
+            <w:r>
+              <w:rPr>
+                <w:rFonts w:ascii="Arial" w:cs="Arial" w:eastAsia="Arial" w:hAnsi="Arial"/>
+                <w:b w:val="1"/>
+                <w:bCs w:val="1"/>
+                <w:sz w:val="22"/>
+                <w:szCs w:val="22"/>
+                <w:rtl w:val="0"/>
+              </w:rPr>
+              <w:t xml:space="preserve">30</w:t>
+            </w:r>
+          </w:p>
+        </w:tc>
+        <w:tc>
+          <w:tcPr>
+            <w:tcW w:w="2340" w:type="dxa"/>
+            <w:shd w:fill="F2F2F2" w:val="clear"/>
+            <w:vAlign w:val="center"/>
+          </w:tcPr>
+          <w:p>
+            <w:pPr>
+              <w:spacing w:after="40" w:before="40" w:lineRule="auto"/>
+              <w:jc w:val="center"/>
+              <w:rPr>
+                <w:rFonts w:ascii="Arial" w:cs="Arial" w:eastAsia="Arial" w:hAnsi="Arial"/>
+                <w:b w:val="1"/>
+                <w:bCs w:val="1"/>
+                <w:sz w:val="22"/>
+                <w:szCs w:val="22"/>
+              </w:rPr>
+            </w:pPr>
+            <w:r>
+              <w:rPr>
+                <w:rFonts w:ascii="Arial" w:cs="Arial" w:eastAsia="Arial" w:hAnsi="Arial"/>
+                <w:b w:val="1"/>
+                <w:bCs w:val="1"/>
+                <w:sz w:val="22"/>
+                <w:szCs w:val="22"/>
+                <w:rtl w:val="0"/>
+              </w:rPr>
+              <w:t xml:space="preserve">100 %</w:t>
+            </w:r>
+          </w:p>
+        </w:tc>
+      </w:tr>
+    </w:tbl>
+    <w:p>
+      <w:pPr>
+        <w:spacing w:after="0" w:before="0" w:lineRule="auto"/>
+        <w:rPr>
+          <w:rFonts w:ascii="Arial" w:cs="Arial" w:eastAsia="Arial" w:hAnsi="Arial"/>
+          <w:sz w:val="24"/>
+          <w:szCs w:val="24"/>
+        </w:rPr>
+      </w:pPr>
+    </w:p>
+    <w:p>
+      <w:pPr>
+        <w:spacing w:after="240" w:before="240" w:lineRule="auto"/>
+        <w:rPr>
+          <w:rFonts w:ascii="Arial" w:cs="Arial" w:eastAsia="Arial" w:hAnsi="Arial"/>
+          <w:b w:val="1"/>
+          <w:bCs w:val="1"/>
+          <w:sz w:val="22"/>
+          <w:szCs w:val="22"/>
+        </w:rPr>
+      </w:pPr>
+      <w:r>
+        <w:rPr>
+          <w:rFonts w:ascii="Arial" w:cs="Arial" w:eastAsia="Arial" w:hAnsi="Arial"/>
+          <w:b w:val="1"/>
+          <w:bCs w:val="1"/>
+          <w:sz w:val="22"/>
+          <w:szCs w:val="22"/>
+          <w:rtl w:val="0"/>
+        </w:rPr>
+        <w:t xml:space="preserve">Tabla 10. ¿Crees que este tipo de preparación pude atraer a los jóvenes?</w:t>
+      </w:r>
+    </w:p>
+    <w:tbl>
+      <w:tblPr>
+        <w:tblStyle w:val="Tablanormal"/>
+        <w:tblW w:w="9360" w:type="dxa"/>
+        <w:jc w:val="left"/>
+        <w:tblBorders>
+          <w:top w:color="000000" w:space="0" w:sz="4" w:val="single"/>
+          <w:left w:color="000000" w:space="0" w:sz="4" w:val="single"/>
+          <w:bottom w:color="000000" w:space="0" w:sz="4" w:val="single"/>
+          <w:right w:color="000000" w:space="0" w:sz="4" w:val="single"/>
+          <w:insideH w:color="000000" w:space="0" w:sz="4" w:val="single"/>
+          <w:insideV w:color="000000" w:space="0" w:sz="4" w:val="single"/>
+        </w:tblBorders>
+        <w:tblLayout w:type="fixed"/>
+        <w:tblCellMar>
+          <w:top w:w="60" w:type="dxa"/>
+          <w:left w:w="108" w:type="dxa"/>
+          <w:bottom w:w="60" w:type="dxa"/>
+          <w:right w:w="108" w:type="dxa"/>
+        </w:tblCellMar>
+      </w:tblPr>
+      <w:tblGrid>
+        <w:gridCol w:w="4680"/>
+        <w:gridCol w:w="2340"/>
+        <w:gridCol w:w="2340"/>
+      </w:tblGrid>
+      <w:tr>
+        <w:trPr>
+          <w:tblHeader/>
+        </w:trPr>
+        <w:tc>
+          <w:tcPr>
+            <w:tcW w:w="4680" w:type="dxa"/>
+            <w:shd w:fill="D9D9D9" w:val="clear"/>
+            <w:vAlign w:val="center"/>
+          </w:tcPr>
+          <w:p>
+            <w:pPr>
+              <w:spacing w:after="40" w:before="40" w:lineRule="auto"/>
+              <w:jc w:val="left"/>
+              <w:rPr>
+                <w:rFonts w:ascii="Arial" w:cs="Arial" w:eastAsia="Arial" w:hAnsi="Arial"/>
+                <w:b w:val="1"/>
+                <w:bCs w:val="1"/>
+                <w:sz w:val="22"/>
+                <w:szCs w:val="22"/>
+              </w:rPr>
+            </w:pPr>
+            <w:r>
+              <w:rPr>
+                <w:rFonts w:ascii="Arial" w:cs="Arial" w:eastAsia="Arial" w:hAnsi="Arial"/>
+                <w:b w:val="1"/>
+                <w:bCs w:val="1"/>
+                <w:sz w:val="22"/>
+                <w:szCs w:val="22"/>
+                <w:rtl w:val="0"/>
+              </w:rPr>
+              <w:t xml:space="preserve">RESPUESTAS</w:t>
+            </w:r>
+          </w:p>
+        </w:tc>
+        <w:tc>
+          <w:tcPr>
+            <w:tcW w:w="2340" w:type="dxa"/>
+            <w:shd w:fill="D9D9D9" w:val="clear"/>
+            <w:vAlign w:val="center"/>
+          </w:tcPr>
+          <w:p>
+            <w:pPr>
+              <w:spacing w:after="40" w:before="40" w:lineRule="auto"/>
+              <w:jc w:val="center"/>
+              <w:rPr>
+                <w:rFonts w:ascii="Arial" w:cs="Arial" w:eastAsia="Arial" w:hAnsi="Arial"/>
+                <w:b w:val="1"/>
+                <w:bCs w:val="1"/>
+                <w:sz w:val="22"/>
+                <w:szCs w:val="22"/>
+              </w:rPr>
+            </w:pPr>
+            <w:r>
+              <w:rPr>
+                <w:rFonts w:ascii="Arial" w:cs="Arial" w:eastAsia="Arial" w:hAnsi="Arial"/>
+                <w:b w:val="1"/>
+                <w:bCs w:val="1"/>
+                <w:sz w:val="22"/>
+                <w:szCs w:val="22"/>
+                <w:rtl w:val="0"/>
+              </w:rPr>
+              <w:t xml:space="preserve">FRECUENCIAS</w:t>
+            </w:r>
+          </w:p>
+        </w:tc>
+        <w:tc>
+          <w:tcPr>
+            <w:tcW w:w="2340" w:type="dxa"/>
+            <w:shd w:fill="D9D9D9" w:val="clear"/>
+            <w:vAlign w:val="center"/>
+          </w:tcPr>
+          <w:p>
+            <w:pPr>
+              <w:spacing w:after="40" w:before="40" w:lineRule="auto"/>
+              <w:jc w:val="center"/>
+              <w:rPr>
+                <w:rFonts w:ascii="Arial" w:cs="Arial" w:eastAsia="Arial" w:hAnsi="Arial"/>
+                <w:b w:val="1"/>
+                <w:bCs w:val="1"/>
+                <w:sz w:val="22"/>
+                <w:szCs w:val="22"/>
+              </w:rPr>
+            </w:pPr>
+            <w:r>
+              <w:rPr>
+                <w:rFonts w:ascii="Arial" w:cs="Arial" w:eastAsia="Arial" w:hAnsi="Arial"/>
+                <w:b w:val="1"/>
+                <w:bCs w:val="1"/>
+                <w:sz w:val="22"/>
+                <w:szCs w:val="22"/>
+                <w:rtl w:val="0"/>
+              </w:rPr>
+              <w:t xml:space="preserve">%</w:t>
+            </w:r>
+          </w:p>
+        </w:tc>
+      </w:tr>
+      <w:tr>
+        <w:tc>
+          <w:tcPr>
+            <w:tcW w:w="4680" w:type="dxa"/>
+            <w:vAlign w:val="center"/>
+          </w:tcPr>
+          <w:p>
+            <w:pPr>
+              <w:spacing w:after="40" w:before="40" w:lineRule="auto"/>
+              <w:jc w:val="left"/>
+              <w:rPr>
+                <w:rFonts w:ascii="Arial" w:cs="Arial" w:eastAsia="Arial" w:hAnsi="Arial"/>
+                <w:sz w:val="22"/>
+                <w:szCs w:val="22"/>
+              </w:rPr>
+            </w:pPr>
+            <w:r>
+              <w:rPr>
+                <w:rFonts w:ascii="Arial" w:cs="Arial" w:eastAsia="Arial" w:hAnsi="Arial"/>
+                <w:sz w:val="22"/>
+                <w:szCs w:val="22"/>
+                <w:rtl w:val="0"/>
+              </w:rPr>
+              <w:t xml:space="preserve">Si</w:t>
+            </w:r>
+          </w:p>
+        </w:tc>
+        <w:tc>
+          <w:tcPr>
+            <w:tcW w:w="2340" w:type="dxa"/>
+            <w:vAlign w:val="center"/>
+          </w:tcPr>
+          <w:p>
+            <w:pPr>
+              <w:spacing w:after="40" w:before="40" w:lineRule="auto"/>
+              <w:jc w:val="center"/>
+              <w:rPr>
+                <w:rFonts w:ascii="Arial" w:cs="Arial" w:eastAsia="Arial" w:hAnsi="Arial"/>
+                <w:sz w:val="22"/>
+                <w:szCs w:val="22"/>
+              </w:rPr>
+            </w:pPr>
+            <w:r>
+              <w:rPr>
+                <w:rFonts w:ascii="Arial" w:cs="Arial" w:eastAsia="Arial" w:hAnsi="Arial"/>
+                <w:sz w:val="22"/>
+                <w:szCs w:val="22"/>
+                <w:rtl w:val="0"/>
+              </w:rPr>
+              <w:t xml:space="preserve">23</w:t>
+            </w:r>
+          </w:p>
+        </w:tc>
+        <w:tc>
+          <w:tcPr>
+            <w:tcW w:w="2340" w:type="dxa"/>
+            <w:vAlign w:val="center"/>
+          </w:tcPr>
+          <w:p>
+            <w:pPr>
+              <w:spacing w:after="40" w:before="40" w:lineRule="auto"/>
+              <w:jc w:val="center"/>
+              <w:rPr>
+                <w:rFonts w:ascii="Arial" w:cs="Arial" w:eastAsia="Arial" w:hAnsi="Arial"/>
+                <w:sz w:val="22"/>
+                <w:szCs w:val="22"/>
+              </w:rPr>
+            </w:pPr>
+            <w:r>
+              <w:rPr>
+                <w:rFonts w:ascii="Arial" w:cs="Arial" w:eastAsia="Arial" w:hAnsi="Arial"/>
+                <w:sz w:val="22"/>
+                <w:szCs w:val="22"/>
+                <w:rtl w:val="0"/>
+              </w:rPr>
+              <w:t xml:space="preserve">77 %</w:t>
+            </w:r>
+          </w:p>
+        </w:tc>
+      </w:tr>
+      <w:tr>
+        <w:tc>
+          <w:tcPr>
+            <w:tcW w:w="4680" w:type="dxa"/>
+            <w:vAlign w:val="center"/>
+          </w:tcPr>
+          <w:p>
+            <w:pPr>
+              <w:spacing w:after="40" w:before="40" w:lineRule="auto"/>
+              <w:jc w:val="left"/>
+              <w:rPr>
+                <w:rFonts w:ascii="Arial" w:cs="Arial" w:eastAsia="Arial" w:hAnsi="Arial"/>
+                <w:sz w:val="22"/>
+                <w:szCs w:val="22"/>
+              </w:rPr>
+            </w:pPr>
+            <w:r>
+              <w:rPr>
+                <w:rFonts w:ascii="Arial" w:cs="Arial" w:eastAsia="Arial" w:hAnsi="Arial"/>
+                <w:sz w:val="22"/>
+                <w:szCs w:val="22"/>
+                <w:rtl w:val="0"/>
+              </w:rPr>
+              <w:t xml:space="preserve">No</w:t>
+            </w:r>
+          </w:p>
+        </w:tc>
+        <w:tc>
+          <w:tcPr>
+            <w:tcW w:w="2340" w:type="dxa"/>
+            <w:vAlign w:val="center"/>
+          </w:tcPr>
+          <w:p>
+            <w:pPr>
+              <w:spacing w:after="40" w:before="40" w:lineRule="auto"/>
+              <w:jc w:val="center"/>
+              <w:rPr>
+                <w:rFonts w:ascii="Arial" w:cs="Arial" w:eastAsia="Arial" w:hAnsi="Arial"/>
+                <w:sz w:val="22"/>
+                <w:szCs w:val="22"/>
+              </w:rPr>
+            </w:pPr>
+            <w:r>
+              <w:rPr>
+                <w:rFonts w:ascii="Arial" w:cs="Arial" w:eastAsia="Arial" w:hAnsi="Arial"/>
+                <w:sz w:val="22"/>
+                <w:szCs w:val="22"/>
+                <w:rtl w:val="0"/>
+              </w:rPr>
+              <w:t xml:space="preserve">7</w:t>
+            </w:r>
+          </w:p>
+        </w:tc>
+        <w:tc>
+          <w:tcPr>
+            <w:tcW w:w="2340" w:type="dxa"/>
+            <w:vAlign w:val="center"/>
+          </w:tcPr>
+          <w:p>
+            <w:pPr>
+              <w:spacing w:after="40" w:before="40" w:lineRule="auto"/>
+              <w:jc w:val="center"/>
+              <w:rPr>
+                <w:rFonts w:ascii="Arial" w:cs="Arial" w:eastAsia="Arial" w:hAnsi="Arial"/>
+                <w:sz w:val="22"/>
+                <w:szCs w:val="22"/>
+              </w:rPr>
+            </w:pPr>
+            <w:r>
+              <w:rPr>
+                <w:rFonts w:ascii="Arial" w:cs="Arial" w:eastAsia="Arial" w:hAnsi="Arial"/>
+                <w:sz w:val="22"/>
+                <w:szCs w:val="22"/>
+                <w:rtl w:val="0"/>
+              </w:rPr>
+              <w:t xml:space="preserve">23 %</w:t>
+            </w:r>
+          </w:p>
+        </w:tc>
+      </w:tr>
+      <w:tr>
+        <w:tc>
+          <w:tcPr>
+            <w:tcW w:w="4680" w:type="dxa"/>
+            <w:shd w:fill="F2F2F2" w:val="clear"/>
+            <w:vAlign w:val="center"/>
+          </w:tcPr>
+          <w:p>
+            <w:pPr>
+              <w:spacing w:after="40" w:before="40" w:lineRule="auto"/>
+              <w:jc w:val="left"/>
+              <w:rPr>
+                <w:rFonts w:ascii="Arial" w:cs="Arial" w:eastAsia="Arial" w:hAnsi="Arial"/>
+                <w:b w:val="1"/>
+                <w:bCs w:val="1"/>
+                <w:sz w:val="22"/>
+                <w:szCs w:val="22"/>
+              </w:rPr>
+            </w:pPr>
+            <w:r>
+              <w:rPr>
+                <w:rFonts w:ascii="Arial" w:cs="Arial" w:eastAsia="Arial" w:hAnsi="Arial"/>
+                <w:b w:val="1"/>
+                <w:bCs w:val="1"/>
+                <w:sz w:val="22"/>
+                <w:szCs w:val="22"/>
+                <w:rtl w:val="0"/>
+              </w:rPr>
+              <w:t xml:space="preserve">TOTAL</w:t>
+            </w:r>
+          </w:p>
+        </w:tc>
+        <w:tc>
+          <w:tcPr>
+            <w:tcW w:w="2340" w:type="dxa"/>
+            <w:shd w:fill="F2F2F2" w:val="clear"/>
+            <w:vAlign w:val="center"/>
+          </w:tcPr>
+          <w:p>
+            <w:pPr>
+              <w:spacing w:after="40" w:before="40" w:lineRule="auto"/>
+              <w:jc w:val="center"/>
+              <w:rPr>
+                <w:rFonts w:ascii="Arial" w:cs="Arial" w:eastAsia="Arial" w:hAnsi="Arial"/>
+                <w:b w:val="1"/>
+                <w:bCs w:val="1"/>
+                <w:sz w:val="22"/>
+                <w:szCs w:val="22"/>
+              </w:rPr>
+            </w:pPr>
+            <w:r>
+              <w:rPr>
+                <w:rFonts w:ascii="Arial" w:cs="Arial" w:eastAsia="Arial" w:hAnsi="Arial"/>
+                <w:b w:val="1"/>
+                <w:bCs w:val="1"/>
+                <w:sz w:val="22"/>
+                <w:szCs w:val="22"/>
+                <w:rtl w:val="0"/>
+              </w:rPr>
+              <w:t xml:space="preserve">30</w:t>
+            </w:r>
+          </w:p>
+        </w:tc>
+        <w:tc>
+          <w:tcPr>
+            <w:tcW w:w="2340" w:type="dxa"/>
+            <w:shd w:fill="F2F2F2" w:val="clear"/>
+            <w:vAlign w:val="center"/>
+          </w:tcPr>
+          <w:p>
+            <w:pPr>
+              <w:spacing w:after="40" w:before="40" w:lineRule="auto"/>
+              <w:jc w:val="center"/>
+              <w:rPr>
+                <w:rFonts w:ascii="Arial" w:cs="Arial" w:eastAsia="Arial" w:hAnsi="Arial"/>
+                <w:b w:val="1"/>
+                <w:bCs w:val="1"/>
+                <w:sz w:val="22"/>
+                <w:szCs w:val="22"/>
+              </w:rPr>
+            </w:pPr>
+            <w:r>
+              <w:rPr>
+                <w:rFonts w:ascii="Arial" w:cs="Arial" w:eastAsia="Arial" w:hAnsi="Arial"/>
+                <w:b w:val="1"/>
+                <w:bCs w:val="1"/>
+                <w:sz w:val="22"/>
+                <w:szCs w:val="22"/>
+                <w:rtl w:val="0"/>
+              </w:rPr>
+              <w:t xml:space="preserve">100 %</w:t>
+            </w:r>
+          </w:p>
+        </w:tc>
+      </w:tr>
+    </w:tbl>
+    <w:p>
+      <w:pPr>
+        <w:spacing w:after="0" w:before="0" w:lineRule="auto"/>
+        <w:rPr>
+          <w:rFonts w:ascii="Arial" w:cs="Arial" w:eastAsia="Arial" w:hAnsi="Arial"/>
+          <w:sz w:val="24"/>
+          <w:szCs w:val="24"/>
+        </w:rPr>
+      </w:pPr>
+    </w:p>
+    <w:p>
+      <w:pPr>
+        <w:spacing w:after="240" w:before="240" w:lineRule="auto"/>
+        <w:rPr>
+          <w:rFonts w:ascii="Arial" w:cs="Arial" w:eastAsia="Arial" w:hAnsi="Arial"/>
+          <w:sz w:val="20"/>
+          <w:szCs w:val="20"/>
+        </w:rPr>
+      </w:pPr>
+      <w:r>
+        <w:rPr>
+          <w:rFonts w:ascii="Arial" w:cs="Arial" w:eastAsia="Arial" w:hAnsi="Arial"/>
+          <w:sz w:val="20"/>
+          <w:szCs w:val="20"/>
+          <w:rtl w:val="0"/>
+        </w:rPr>
+        <w:t xml:space="preserve">Fuente: elaboración propia a partir de las respuestas del formulario (n = 30). Los porcentajes se encuentran aproximados al número entero más cercano, por lo cual algunas preguntas suman 99 % o 101 %.</w:t>
       </w:r>
     </w:p>
     <w:p>

</xml_diff>